<commit_message>
Inserido imagem no fundo do site.
</commit_message>
<xml_diff>
--- a/02 - Documentação/Documento Principal.docx
+++ b/02 - Documentação/Documento Principal.docx
@@ -1609,13 +1609,85 @@
         <w:ind w:left="720"/>
         <w:rPr>
           <w:rFonts w:asciiTheme="minorHAnsi" w:hAnsiTheme="minorHAnsi"/>
-        </w:rPr>
-      </w:pPr>
-      <w:r>
-        <w:rPr>
+          <w:i/>
+          <w:iCs/>
+        </w:rPr>
+      </w:pPr>
+      <w:r>
+        <w:rPr>
+          <w:rFonts w:asciiTheme="minorHAnsi" w:hAnsiTheme="minorHAnsi"/>
           <w:noProof/>
         </w:rPr>
         <w:lastRenderedPageBreak/>
+        <w:drawing>
+          <wp:anchor distT="0" distB="0" distL="114300" distR="114300" simplePos="0" relativeHeight="251658240" behindDoc="1" locked="0" layoutInCell="1" allowOverlap="1" wp14:anchorId="2B44D042" wp14:editId="059C7317">
+            <wp:simplePos x="0" y="0"/>
+            <wp:positionH relativeFrom="margin">
+              <wp:align>right</wp:align>
+            </wp:positionH>
+            <wp:positionV relativeFrom="paragraph">
+              <wp:posOffset>4807585</wp:posOffset>
+            </wp:positionV>
+            <wp:extent cx="5387340" cy="2491740"/>
+            <wp:effectExtent l="0" t="0" r="3810" b="3810"/>
+            <wp:wrapTight wrapText="bothSides">
+              <wp:wrapPolygon edited="0">
+                <wp:start x="0" y="0"/>
+                <wp:lineTo x="0" y="21468"/>
+                <wp:lineTo x="21539" y="21468"/>
+                <wp:lineTo x="21539" y="0"/>
+                <wp:lineTo x="0" y="0"/>
+              </wp:wrapPolygon>
+            </wp:wrapTight>
+            <wp:docPr id="800620852" name="Imagem 2"/>
+            <wp:cNvGraphicFramePr>
+              <a:graphicFrameLocks xmlns:a="http://schemas.openxmlformats.org/drawingml/2006/main" noChangeAspect="1"/>
+            </wp:cNvGraphicFramePr>
+            <a:graphic xmlns:a="http://schemas.openxmlformats.org/drawingml/2006/main">
+              <a:graphicData uri="http://schemas.openxmlformats.org/drawingml/2006/picture">
+                <pic:pic xmlns:pic="http://schemas.openxmlformats.org/drawingml/2006/picture">
+                  <pic:nvPicPr>
+                    <pic:cNvPr id="0" name="Picture 3"/>
+                    <pic:cNvPicPr>
+                      <a:picLocks noChangeAspect="1" noChangeArrowheads="1"/>
+                    </pic:cNvPicPr>
+                  </pic:nvPicPr>
+                  <pic:blipFill>
+                    <a:blip r:embed="rId9" cstate="print">
+                      <a:extLst>
+                        <a:ext uri="{28A0092B-C50C-407E-A947-70E740481C1C}">
+                          <a14:useLocalDpi xmlns:a14="http://schemas.microsoft.com/office/drawing/2010/main" val="0"/>
+                        </a:ext>
+                      </a:extLst>
+                    </a:blip>
+                    <a:srcRect/>
+                    <a:stretch>
+                      <a:fillRect/>
+                    </a:stretch>
+                  </pic:blipFill>
+                  <pic:spPr bwMode="auto">
+                    <a:xfrm>
+                      <a:off x="0" y="0"/>
+                      <a:ext cx="5387340" cy="2491740"/>
+                    </a:xfrm>
+                    <a:prstGeom prst="rect">
+                      <a:avLst/>
+                    </a:prstGeom>
+                    <a:noFill/>
+                    <a:ln>
+                      <a:noFill/>
+                    </a:ln>
+                  </pic:spPr>
+                </pic:pic>
+              </a:graphicData>
+            </a:graphic>
+          </wp:anchor>
+        </w:drawing>
+      </w:r>
+      <w:r>
+        <w:rPr>
+          <w:noProof/>
+        </w:rPr>
         <w:drawing>
           <wp:inline distT="0" distB="0" distL="0" distR="0" wp14:anchorId="26A8BD44" wp14:editId="679C366C">
             <wp:extent cx="3604260" cy="4587240"/>
@@ -1634,7 +1706,7 @@
                     </pic:cNvPicPr>
                   </pic:nvPicPr>
                   <pic:blipFill>
-                    <a:blip r:embed="rId9">
+                    <a:blip r:embed="rId10">
                       <a:extLst>
                         <a:ext uri="{28A0092B-C50C-407E-A947-70E740481C1C}">
                           <a14:useLocalDpi xmlns:a14="http://schemas.microsoft.com/office/drawing/2010/main" val="0"/>
@@ -1671,6 +1743,32 @@
         </w:rPr>
         <w:br/>
       </w:r>
+      <w:r>
+        <w:rPr>
+          <w:rFonts w:asciiTheme="minorHAnsi" w:hAnsiTheme="minorHAnsi"/>
+          <w:i/>
+          <w:iCs/>
+        </w:rPr>
+        <w:t>RF001 - Acesso à aplicação. Home em resolução mobile</w:t>
+      </w:r>
+    </w:p>
+    <w:p>
+      <w:pPr>
+        <w:pStyle w:val="NormalWeb"/>
+        <w:rPr>
+          <w:rFonts w:asciiTheme="minorHAnsi" w:hAnsiTheme="minorHAnsi"/>
+          <w:i/>
+          <w:iCs/>
+        </w:rPr>
+      </w:pPr>
+      <w:r>
+        <w:rPr>
+          <w:rFonts w:asciiTheme="minorHAnsi" w:hAnsiTheme="minorHAnsi"/>
+          <w:i/>
+          <w:iCs/>
+        </w:rPr>
+        <w:t>RF001 - Acesso à aplicação. Home em tela Desktop.</w:t>
+      </w:r>
     </w:p>
     <w:p>
       <w:pPr>
@@ -1701,27 +1799,23 @@
     <w:p>
       <w:pPr>
         <w:pStyle w:val="NormalWeb"/>
-        <w:ind w:left="720"/>
         <w:rPr>
           <w:rFonts w:asciiTheme="minorHAnsi" w:hAnsiTheme="minorHAnsi"/>
-        </w:rPr>
-      </w:pPr>
-      <w:r>
-        <w:rPr>
-          <w:rFonts w:asciiTheme="minorHAnsi" w:hAnsiTheme="minorHAnsi"/>
-        </w:rPr>
-        <w:br/>
-      </w:r>
+          <w:i/>
+          <w:iCs/>
+        </w:rPr>
+      </w:pPr>
       <w:r>
         <w:rPr>
           <w:rFonts w:asciiTheme="minorHAnsi" w:hAnsiTheme="minorHAnsi"/>
           <w:noProof/>
         </w:rPr>
+        <w:lastRenderedPageBreak/>
         <w:drawing>
-          <wp:inline distT="0" distB="0" distL="0" distR="0" wp14:anchorId="2B44D042" wp14:editId="09F63731">
-            <wp:extent cx="5387340" cy="2491740"/>
-            <wp:effectExtent l="0" t="0" r="3810" b="3810"/>
-            <wp:docPr id="800620852" name="Imagem 2"/>
+          <wp:inline distT="0" distB="0" distL="0" distR="0" wp14:anchorId="14B233BD" wp14:editId="2C14D9D2">
+            <wp:extent cx="5394960" cy="2400300"/>
+            <wp:effectExtent l="0" t="0" r="0" b="0"/>
+            <wp:docPr id="1215415507" name="Imagem 1"/>
             <wp:cNvGraphicFramePr>
               <a:graphicFrameLocks xmlns:a="http://schemas.openxmlformats.org/drawingml/2006/main" noChangeAspect="1"/>
             </wp:cNvGraphicFramePr>
@@ -1729,13 +1823,13 @@
               <a:graphicData uri="http://schemas.openxmlformats.org/drawingml/2006/picture">
                 <pic:pic xmlns:pic="http://schemas.openxmlformats.org/drawingml/2006/picture">
                   <pic:nvPicPr>
-                    <pic:cNvPr id="0" name="Picture 3"/>
+                    <pic:cNvPr id="0" name="Picture 1"/>
                     <pic:cNvPicPr>
                       <a:picLocks noChangeAspect="1" noChangeArrowheads="1"/>
                     </pic:cNvPicPr>
                   </pic:nvPicPr>
                   <pic:blipFill>
-                    <a:blip r:embed="rId10" cstate="print">
+                    <a:blip r:embed="rId11" cstate="print">
                       <a:extLst>
                         <a:ext uri="{28A0092B-C50C-407E-A947-70E740481C1C}">
                           <a14:useLocalDpi xmlns:a14="http://schemas.microsoft.com/office/drawing/2010/main" val="0"/>
@@ -1750,7 +1844,7 @@
                   <pic:spPr bwMode="auto">
                     <a:xfrm>
                       <a:off x="0" y="0"/>
-                      <a:ext cx="5387340" cy="2491740"/>
+                      <a:ext cx="5394960" cy="2400300"/>
                     </a:xfrm>
                     <a:prstGeom prst="rect">
                       <a:avLst/>
@@ -1766,14 +1860,44 @@
           </wp:inline>
         </w:drawing>
       </w:r>
+      <w:r>
+        <w:rPr>
+          <w:rFonts w:asciiTheme="minorHAnsi" w:hAnsiTheme="minorHAnsi"/>
+          <w:i/>
+          <w:iCs/>
+        </w:rPr>
+        <w:br/>
+      </w:r>
+      <w:r>
+        <w:rPr>
+          <w:rFonts w:asciiTheme="minorHAnsi" w:hAnsiTheme="minorHAnsi"/>
+          <w:i/>
+          <w:iCs/>
+        </w:rPr>
+        <w:t xml:space="preserve">RF002 - Realizar </w:t>
+      </w:r>
+      <w:proofErr w:type="spellStart"/>
+      <w:r>
+        <w:rPr>
+          <w:rFonts w:asciiTheme="minorHAnsi" w:hAnsiTheme="minorHAnsi"/>
+          <w:i/>
+          <w:iCs/>
+        </w:rPr>
+        <w:t>pedido_Botão_FinalizarPedido</w:t>
+      </w:r>
+      <w:proofErr w:type="spellEnd"/>
+      <w:r>
+        <w:rPr>
+          <w:rFonts w:asciiTheme="minorHAnsi" w:hAnsiTheme="minorHAnsi"/>
+          <w:i/>
+          <w:iCs/>
+        </w:rPr>
+        <w:t>.</w:t>
+      </w:r>
     </w:p>
     <w:p>
       <w:pPr>
         <w:pStyle w:val="NormalWeb"/>
-        <w:numPr>
-          <w:ilvl w:val="0"/>
-          <w:numId w:val="7"/>
-        </w:numPr>
         <w:rPr>
           <w:rFonts w:asciiTheme="minorHAnsi" w:hAnsiTheme="minorHAnsi"/>
         </w:rPr>
@@ -1783,36 +1907,28 @@
           <w:rFonts w:asciiTheme="minorHAnsi" w:hAnsiTheme="minorHAnsi"/>
           <w:b/>
           <w:bCs/>
-        </w:rPr>
-        <w:t>RF003</w:t>
-      </w:r>
-      <w:r>
-        <w:rPr>
-          <w:rFonts w:asciiTheme="minorHAnsi" w:hAnsiTheme="minorHAnsi"/>
-        </w:rPr>
-        <w:t xml:space="preserve"> — Selecionar unidade: O sistema deve permitir que o cliente escolha a unidade da Raízes do Nordeste onde deseja realizar o pedido.</w:t>
-      </w:r>
-    </w:p>
-    <w:p>
-      <w:pPr>
-        <w:pStyle w:val="NormalWeb"/>
-        <w:ind w:left="720"/>
-        <w:rPr>
-          <w:rFonts w:asciiTheme="minorHAnsi" w:hAnsiTheme="minorHAnsi"/>
-        </w:rPr>
-      </w:pPr>
-      <w:r>
-        <w:rPr>
-          <w:rFonts w:asciiTheme="minorHAnsi" w:hAnsiTheme="minorHAnsi"/>
-          <w:b/>
-          <w:bCs/>
           <w:noProof/>
         </w:rPr>
-        <w:lastRenderedPageBreak/>
         <w:drawing>
-          <wp:inline distT="0" distB="0" distL="0" distR="0" wp14:anchorId="2FD084F6" wp14:editId="47FA6CB6">
+          <wp:anchor distT="0" distB="0" distL="114300" distR="114300" simplePos="0" relativeHeight="251659264" behindDoc="1" locked="0" layoutInCell="1" allowOverlap="1" wp14:anchorId="2FD084F6" wp14:editId="04C59C96">
+            <wp:simplePos x="0" y="0"/>
+            <wp:positionH relativeFrom="margin">
+              <wp:posOffset>-124460</wp:posOffset>
+            </wp:positionH>
+            <wp:positionV relativeFrom="paragraph">
+              <wp:posOffset>410845</wp:posOffset>
+            </wp:positionV>
             <wp:extent cx="5402580" cy="1790700"/>
             <wp:effectExtent l="0" t="0" r="7620" b="0"/>
+            <wp:wrapTight wrapText="bothSides">
+              <wp:wrapPolygon edited="0">
+                <wp:start x="0" y="0"/>
+                <wp:lineTo x="0" y="21370"/>
+                <wp:lineTo x="21554" y="21370"/>
+                <wp:lineTo x="21554" y="0"/>
+                <wp:lineTo x="0" y="0"/>
+              </wp:wrapPolygon>
+            </wp:wrapTight>
             <wp:docPr id="449902285" name="Imagem 5"/>
             <wp:cNvGraphicFramePr>
               <a:graphicFrameLocks xmlns:a="http://schemas.openxmlformats.org/drawingml/2006/main" noChangeAspect="1"/>
@@ -1827,7 +1943,7 @@
                     </pic:cNvPicPr>
                   </pic:nvPicPr>
                   <pic:blipFill>
-                    <a:blip r:embed="rId11" cstate="print">
+                    <a:blip r:embed="rId12" cstate="print">
                       <a:extLst>
                         <a:ext uri="{28A0092B-C50C-407E-A947-70E740481C1C}">
                           <a14:useLocalDpi xmlns:a14="http://schemas.microsoft.com/office/drawing/2010/main" val="0"/>
@@ -1855,9 +1971,46 @@
                 </pic:pic>
               </a:graphicData>
             </a:graphic>
-          </wp:inline>
+          </wp:anchor>
         </w:drawing>
       </w:r>
+      <w:r>
+        <w:rPr>
+          <w:rFonts w:asciiTheme="minorHAnsi" w:hAnsiTheme="minorHAnsi"/>
+          <w:b/>
+          <w:bCs/>
+        </w:rPr>
+        <w:t>RF003</w:t>
+      </w:r>
+      <w:r>
+        <w:rPr>
+          <w:rFonts w:asciiTheme="minorHAnsi" w:hAnsiTheme="minorHAnsi"/>
+        </w:rPr>
+        <w:t xml:space="preserve"> — Selecionar unidade: O sistema deve permitir que o cliente escolha a unidade da Raízes do Nordeste onde deseja realizar o pedido.</w:t>
+      </w:r>
+      <w:r>
+        <w:rPr>
+          <w:rFonts w:asciiTheme="minorHAnsi" w:hAnsiTheme="minorHAnsi"/>
+        </w:rPr>
+        <w:br/>
+      </w:r>
+      <w:r>
+        <w:rPr>
+          <w:rFonts w:asciiTheme="minorHAnsi" w:hAnsiTheme="minorHAnsi"/>
+          <w:i/>
+          <w:iCs/>
+        </w:rPr>
+        <w:t>RF003 - Selecionar unidade.</w:t>
+      </w:r>
+    </w:p>
+    <w:p>
+      <w:pPr>
+        <w:pStyle w:val="NormalWeb"/>
+        <w:ind w:left="360"/>
+        <w:rPr>
+          <w:rFonts w:asciiTheme="minorHAnsi" w:hAnsiTheme="minorHAnsi"/>
+        </w:rPr>
+      </w:pPr>
     </w:p>
     <w:p>
       <w:pPr>
@@ -1900,6 +2053,7 @@
           <w:bCs/>
           <w:noProof/>
         </w:rPr>
+        <w:lastRenderedPageBreak/>
         <w:drawing>
           <wp:inline distT="0" distB="0" distL="0" distR="0" wp14:anchorId="20470B11" wp14:editId="64923D10">
             <wp:extent cx="4701540" cy="4815840"/>
@@ -1918,7 +2072,7 @@
                     </pic:cNvPicPr>
                   </pic:nvPicPr>
                   <pic:blipFill>
-                    <a:blip r:embed="rId12">
+                    <a:blip r:embed="rId13">
                       <a:extLst>
                         <a:ext uri="{28A0092B-C50C-407E-A947-70E740481C1C}">
                           <a14:useLocalDpi xmlns:a14="http://schemas.microsoft.com/office/drawing/2010/main" val="0"/>
@@ -1949,6 +2103,28 @@
           </wp:inline>
         </w:drawing>
       </w:r>
+      <w:r>
+        <w:rPr>
+          <w:rFonts w:asciiTheme="minorHAnsi" w:hAnsiTheme="minorHAnsi"/>
+        </w:rPr>
+        <w:br/>
+      </w:r>
+      <w:r>
+        <w:rPr>
+          <w:rFonts w:asciiTheme="minorHAnsi" w:hAnsiTheme="minorHAnsi"/>
+          <w:i/>
+          <w:iCs/>
+        </w:rPr>
+        <w:t>RF004 - Visualizar cardápio</w:t>
+      </w:r>
+      <w:r>
+        <w:rPr>
+          <w:rFonts w:asciiTheme="minorHAnsi" w:hAnsiTheme="minorHAnsi"/>
+          <w:i/>
+          <w:iCs/>
+        </w:rPr>
+        <w:t>.</w:t>
+      </w:r>
     </w:p>
     <w:p>
       <w:pPr>
@@ -1993,7 +2169,7 @@
         </w:rPr>
         <w:lastRenderedPageBreak/>
         <w:drawing>
-          <wp:inline distT="0" distB="0" distL="0" distR="0" wp14:anchorId="1A5C6666" wp14:editId="733482FB">
+          <wp:inline distT="0" distB="0" distL="0" distR="0" wp14:anchorId="1A5C6666" wp14:editId="5E1CD648">
             <wp:extent cx="4655820" cy="7330440"/>
             <wp:effectExtent l="0" t="0" r="0" b="3810"/>
             <wp:docPr id="1089207303" name="Imagem 7"/>
@@ -2010,7 +2186,7 @@
                     </pic:cNvPicPr>
                   </pic:nvPicPr>
                   <pic:blipFill>
-                    <a:blip r:embed="rId13">
+                    <a:blip r:embed="rId14">
                       <a:extLst>
                         <a:ext uri="{28A0092B-C50C-407E-A947-70E740481C1C}">
                           <a14:useLocalDpi xmlns:a14="http://schemas.microsoft.com/office/drawing/2010/main" val="0"/>
@@ -2041,6 +2217,28 @@
           </wp:inline>
         </w:drawing>
       </w:r>
+      <w:r>
+        <w:rPr>
+          <w:rFonts w:asciiTheme="minorHAnsi" w:hAnsiTheme="minorHAnsi"/>
+        </w:rPr>
+        <w:br/>
+      </w:r>
+      <w:r>
+        <w:rPr>
+          <w:rFonts w:asciiTheme="minorHAnsi" w:hAnsiTheme="minorHAnsi"/>
+          <w:i/>
+          <w:iCs/>
+        </w:rPr>
+        <w:t>RF005 - Visualizar produtos</w:t>
+      </w:r>
+      <w:r>
+        <w:rPr>
+          <w:rFonts w:asciiTheme="minorHAnsi" w:hAnsiTheme="minorHAnsi"/>
+          <w:i/>
+          <w:iCs/>
+        </w:rPr>
+        <w:t>.</w:t>
+      </w:r>
     </w:p>
     <w:p>
       <w:pPr>
@@ -2085,7 +2283,7 @@
         </w:rPr>
         <w:lastRenderedPageBreak/>
         <w:drawing>
-          <wp:inline distT="0" distB="0" distL="0" distR="0" wp14:anchorId="61BD2789" wp14:editId="6FABD0FC">
+          <wp:inline distT="0" distB="0" distL="0" distR="0" wp14:anchorId="61BD2789" wp14:editId="30E8A823">
             <wp:extent cx="2263140" cy="3566160"/>
             <wp:effectExtent l="0" t="0" r="3810" b="0"/>
             <wp:docPr id="1683669270" name="Imagem 8"/>
@@ -2102,7 +2300,7 @@
                     </pic:cNvPicPr>
                   </pic:nvPicPr>
                   <pic:blipFill>
-                    <a:blip r:embed="rId14">
+                    <a:blip r:embed="rId15">
                       <a:extLst>
                         <a:ext uri="{28A0092B-C50C-407E-A947-70E740481C1C}">
                           <a14:useLocalDpi xmlns:a14="http://schemas.microsoft.com/office/drawing/2010/main" val="0"/>
@@ -2133,6 +2331,28 @@
           </wp:inline>
         </w:drawing>
       </w:r>
+      <w:r>
+        <w:rPr>
+          <w:rFonts w:asciiTheme="minorHAnsi" w:hAnsiTheme="minorHAnsi"/>
+        </w:rPr>
+        <w:br/>
+      </w:r>
+      <w:r>
+        <w:rPr>
+          <w:rFonts w:asciiTheme="minorHAnsi" w:hAnsiTheme="minorHAnsi"/>
+          <w:i/>
+          <w:iCs/>
+        </w:rPr>
+        <w:t>RF006 - Adicionar produto ao pedido</w:t>
+      </w:r>
+      <w:r>
+        <w:rPr>
+          <w:rFonts w:asciiTheme="minorHAnsi" w:hAnsiTheme="minorHAnsi"/>
+          <w:i/>
+          <w:iCs/>
+        </w:rPr>
+        <w:t>.</w:t>
+      </w:r>
     </w:p>
     <w:p>
       <w:pPr>
@@ -2357,6 +2577,7 @@
         </w:numPr>
       </w:pPr>
       <w:r>
+        <w:lastRenderedPageBreak/>
         <w:t>O Raízes App utiliza uma arquitetura dividida em três componentes principais: Front-</w:t>
       </w:r>
       <w:proofErr w:type="spellStart"/>
@@ -2365,11 +2586,7 @@
       </w:r>
       <w:proofErr w:type="spellEnd"/>
       <w:r>
-        <w:t xml:space="preserve">, API e banco de dados. Essa organização permite </w:t>
-      </w:r>
-      <w:r>
-        <w:lastRenderedPageBreak/>
-        <w:t>separar a interface apresentada ao usuário das regras de processamento e do armazenamento das informações.</w:t>
+        <w:t>, API e banco de dados. Essa organização permite separar a interface apresentada ao usuário das regras de processamento e do armazenamento das informações.</w:t>
       </w:r>
     </w:p>
     <w:p>
@@ -2842,6 +3059,7 @@
     </w:p>
     <w:p>
       <w:r>
+        <w:lastRenderedPageBreak/>
         <w:t>A estrutura foi organizada para relacionar os pedidos aos usuários e às unidades, bem como os itens aos respectivos pedidos e produtos.</w:t>
       </w:r>
     </w:p>
@@ -2859,7 +3077,6 @@
           <w:b/>
           <w:bCs/>
         </w:rPr>
-        <w:lastRenderedPageBreak/>
         <w:t>4.4 Comunicação entre os componentes</w:t>
       </w:r>
       <w:bookmarkEnd w:id="12"/>
@@ -3123,6 +3340,7 @@
         </w:numPr>
       </w:pPr>
       <w:r>
+        <w:lastRenderedPageBreak/>
         <w:t>Durante os testes locais, foi possível validar a comunicação entre os componentes e confirmar o registro das informações no banco de dados.</w:t>
       </w:r>
     </w:p>
@@ -3153,7 +3371,6 @@
         </w:numPr>
       </w:pPr>
       <w:r>
-        <w:lastRenderedPageBreak/>
         <w:t>A versão desenvolvida contempla as funcionalidades principais do fluxo de realização de pedidos. Entretanto, a aplicação ainda possui limitações, como a ausência de uma estrutura de autenticação completa e a necessidade de disponibilizar a API e o banco de dados em um ambiente acessível externamente para permitir o funcionamento integrado pela internet.</w:t>
       </w:r>
     </w:p>
@@ -3313,6 +3530,7 @@
           <w:b/>
           <w:bCs/>
         </w:rPr>
+        <w:lastRenderedPageBreak/>
         <w:t>6.3 Testes de validação da API</w:t>
       </w:r>
       <w:bookmarkEnd w:id="21"/>
@@ -3326,7 +3544,6 @@
         </w:numPr>
       </w:pPr>
       <w:r>
-        <w:lastRenderedPageBreak/>
         <w:t>Durante os testes da API, foram verificadas situações como ausência de campos obrigatórios, utilização de usuário, pedido ou produto inexistente, quantidade igual a zero e preço negativo.</w:t>
       </w:r>
     </w:p>
@@ -3373,7 +3590,7 @@
                     </pic:cNvPicPr>
                   </pic:nvPicPr>
                   <pic:blipFill>
-                    <a:blip r:embed="rId15">
+                    <a:blip r:embed="rId16">
                       <a:extLst>
                         <a:ext uri="{28A0092B-C50C-407E-A947-70E740481C1C}">
                           <a14:useLocalDpi xmlns:a14="http://schemas.microsoft.com/office/drawing/2010/main" val="0"/>
@@ -3446,7 +3663,7 @@
                     </pic:cNvPicPr>
                   </pic:nvPicPr>
                   <pic:blipFill>
-                    <a:blip r:embed="rId16">
+                    <a:blip r:embed="rId17">
                       <a:extLst>
                         <a:ext uri="{28A0092B-C50C-407E-A947-70E740481C1C}">
                           <a14:useLocalDpi xmlns:a14="http://schemas.microsoft.com/office/drawing/2010/main" val="0"/>
@@ -3574,7 +3791,7 @@
                     </pic:cNvPicPr>
                   </pic:nvPicPr>
                   <pic:blipFill>
-                    <a:blip r:embed="rId17">
+                    <a:blip r:embed="rId18">
                       <a:extLst>
                         <a:ext uri="{28A0092B-C50C-407E-A947-70E740481C1C}">
                           <a14:useLocalDpi xmlns:a14="http://schemas.microsoft.com/office/drawing/2010/main" val="0"/>
@@ -3671,7 +3888,7 @@
                     </pic:cNvPicPr>
                   </pic:nvPicPr>
                   <pic:blipFill>
-                    <a:blip r:embed="rId18">
+                    <a:blip r:embed="rId19">
                       <a:extLst>
                         <a:ext uri="{28A0092B-C50C-407E-A947-70E740481C1C}">
                           <a14:useLocalDpi xmlns:a14="http://schemas.microsoft.com/office/drawing/2010/main" val="0"/>
@@ -3798,7 +4015,7 @@
                     </pic:cNvPicPr>
                   </pic:nvPicPr>
                   <pic:blipFill>
-                    <a:blip r:embed="rId19">
+                    <a:blip r:embed="rId20">
                       <a:extLst>
                         <a:ext uri="{28A0092B-C50C-407E-A947-70E740481C1C}">
                           <a14:useLocalDpi xmlns:a14="http://schemas.microsoft.com/office/drawing/2010/main" val="0"/>
@@ -3904,7 +4121,7 @@
                     </pic:cNvPicPr>
                   </pic:nvPicPr>
                   <pic:blipFill>
-                    <a:blip r:embed="rId20">
+                    <a:blip r:embed="rId21">
                       <a:extLst>
                         <a:ext uri="{28A0092B-C50C-407E-A947-70E740481C1C}">
                           <a14:useLocalDpi xmlns:a14="http://schemas.microsoft.com/office/drawing/2010/main" val="0"/>
@@ -4074,7 +4291,7 @@
                     </pic:cNvPicPr>
                   </pic:nvPicPr>
                   <pic:blipFill>
-                    <a:blip r:embed="rId21">
+                    <a:blip r:embed="rId22">
                       <a:extLst>
                         <a:ext uri="{28A0092B-C50C-407E-A947-70E740481C1C}">
                           <a14:useLocalDpi xmlns:a14="http://schemas.microsoft.com/office/drawing/2010/main" val="0"/>
@@ -4261,7 +4478,7 @@
                     </pic:cNvPicPr>
                   </pic:nvPicPr>
                   <pic:blipFill>
-                    <a:blip r:embed="rId22">
+                    <a:blip r:embed="rId23">
                       <a:extLst>
                         <a:ext uri="{28A0092B-C50C-407E-A947-70E740481C1C}">
                           <a14:useLocalDpi xmlns:a14="http://schemas.microsoft.com/office/drawing/2010/main" val="0"/>
@@ -4440,7 +4657,7 @@
                     </pic:cNvPicPr>
                   </pic:nvPicPr>
                   <pic:blipFill>
-                    <a:blip r:embed="rId23">
+                    <a:blip r:embed="rId24">
                       <a:extLst>
                         <a:ext uri="{28A0092B-C50C-407E-A947-70E740481C1C}">
                           <a14:useLocalDpi xmlns:a14="http://schemas.microsoft.com/office/drawing/2010/main" val="0"/>
@@ -4625,7 +4842,7 @@
                     </pic:cNvPicPr>
                   </pic:nvPicPr>
                   <pic:blipFill>
-                    <a:blip r:embed="rId24">
+                    <a:blip r:embed="rId25">
                       <a:extLst>
                         <a:ext uri="{28A0092B-C50C-407E-A947-70E740481C1C}">
                           <a14:useLocalDpi xmlns:a14="http://schemas.microsoft.com/office/drawing/2010/main" val="0"/>
@@ -4828,7 +5045,7 @@
                     </pic:cNvPicPr>
                   </pic:nvPicPr>
                   <pic:blipFill>
-                    <a:blip r:embed="rId25">
+                    <a:blip r:embed="rId26">
                       <a:extLst>
                         <a:ext uri="{28A0092B-C50C-407E-A947-70E740481C1C}">
                           <a14:useLocalDpi xmlns:a14="http://schemas.microsoft.com/office/drawing/2010/main" val="0"/>
@@ -5006,7 +5223,7 @@
                     </pic:cNvPicPr>
                   </pic:nvPicPr>
                   <pic:blipFill>
-                    <a:blip r:embed="rId26">
+                    <a:blip r:embed="rId27">
                       <a:extLst>
                         <a:ext uri="{28A0092B-C50C-407E-A947-70E740481C1C}">
                           <a14:useLocalDpi xmlns:a14="http://schemas.microsoft.com/office/drawing/2010/main" val="0"/>
@@ -5120,7 +5337,7 @@
                     </pic:cNvPicPr>
                   </pic:nvPicPr>
                   <pic:blipFill>
-                    <a:blip r:embed="rId27">
+                    <a:blip r:embed="rId28">
                       <a:extLst>
                         <a:ext uri="{28A0092B-C50C-407E-A947-70E740481C1C}">
                           <a14:useLocalDpi xmlns:a14="http://schemas.microsoft.com/office/drawing/2010/main" val="0"/>
@@ -5249,7 +5466,7 @@
                     </pic:cNvPicPr>
                   </pic:nvPicPr>
                   <pic:blipFill>
-                    <a:blip r:embed="rId28">
+                    <a:blip r:embed="rId29">
                       <a:extLst>
                         <a:ext uri="{28A0092B-C50C-407E-A947-70E740481C1C}">
                           <a14:useLocalDpi xmlns:a14="http://schemas.microsoft.com/office/drawing/2010/main" val="0"/>
@@ -5432,7 +5649,7 @@
                     </pic:cNvPicPr>
                   </pic:nvPicPr>
                   <pic:blipFill>
-                    <a:blip r:embed="rId29">
+                    <a:blip r:embed="rId30">
                       <a:extLst>
                         <a:ext uri="{28A0092B-C50C-407E-A947-70E740481C1C}">
                           <a14:useLocalDpi xmlns:a14="http://schemas.microsoft.com/office/drawing/2010/main" val="0"/>
@@ -5488,7 +5705,7 @@
                     </pic:cNvPicPr>
                   </pic:nvPicPr>
                   <pic:blipFill>
-                    <a:blip r:embed="rId30">
+                    <a:blip r:embed="rId31">
                       <a:extLst>
                         <a:ext uri="{28A0092B-C50C-407E-A947-70E740481C1C}">
                           <a14:useLocalDpi xmlns:a14="http://schemas.microsoft.com/office/drawing/2010/main" val="0"/>
@@ -5527,7 +5744,7 @@
           <w:noProof/>
         </w:rPr>
         <w:drawing>
-          <wp:inline distT="0" distB="0" distL="0" distR="0" wp14:anchorId="54FFFB6E" wp14:editId="1D685E68">
+          <wp:inline distT="0" distB="0" distL="0" distR="0" wp14:anchorId="54FFFB6E" wp14:editId="237619B9">
             <wp:extent cx="5394960" cy="1844040"/>
             <wp:effectExtent l="0" t="0" r="0" b="3810"/>
             <wp:docPr id="1492892451" name="Imagem 11"/>
@@ -5544,7 +5761,7 @@
                     </pic:cNvPicPr>
                   </pic:nvPicPr>
                   <pic:blipFill>
-                    <a:blip r:embed="rId31" cstate="print">
+                    <a:blip r:embed="rId32" cstate="print">
                       <a:extLst>
                         <a:ext uri="{28A0092B-C50C-407E-A947-70E740481C1C}">
                           <a14:useLocalDpi xmlns:a14="http://schemas.microsoft.com/office/drawing/2010/main" val="0"/>
@@ -5601,7 +5818,7 @@
                     </pic:cNvPicPr>
                   </pic:nvPicPr>
                   <pic:blipFill>
-                    <a:blip r:embed="rId30">
+                    <a:blip r:embed="rId31">
                       <a:extLst>
                         <a:ext uri="{28A0092B-C50C-407E-A947-70E740481C1C}">
                           <a14:useLocalDpi xmlns:a14="http://schemas.microsoft.com/office/drawing/2010/main" val="0"/>
@@ -5812,7 +6029,7 @@
       <w:r>
         <w:br/>
       </w:r>
-      <w:hyperlink r:id="rId32" w:history="1">
+      <w:hyperlink r:id="rId33" w:history="1">
         <w:r>
           <w:rPr>
             <w:rStyle w:val="Hyperlink"/>
@@ -5835,7 +6052,7 @@
       <w:r>
         <w:br/>
       </w:r>
-      <w:hyperlink r:id="rId33" w:history="1">
+      <w:hyperlink r:id="rId34" w:history="1">
         <w:r>
           <w:rPr>
             <w:rStyle w:val="Hyperlink"/>
@@ -5874,7 +6091,7 @@
       <w:r>
         <w:br/>
       </w:r>
-      <w:hyperlink r:id="rId34" w:history="1">
+      <w:hyperlink r:id="rId35" w:history="1">
         <w:r>
           <w:rPr>
             <w:rStyle w:val="Hyperlink"/>
@@ -6152,7 +6369,7 @@
       <w:r>
         <w:t xml:space="preserve">. Disponível em: </w:t>
       </w:r>
-      <w:hyperlink r:id="rId35" w:history="1">
+      <w:hyperlink r:id="rId36" w:history="1">
         <w:r>
           <w:rPr>
             <w:rStyle w:val="Hyperlink"/>
@@ -6185,7 +6402,7 @@
       <w:r>
         <w:t xml:space="preserve"> Help Center. Disponível em: </w:t>
       </w:r>
-      <w:hyperlink r:id="rId36" w:history="1">
+      <w:hyperlink r:id="rId37" w:history="1">
         <w:r>
           <w:rPr>
             <w:rStyle w:val="Hyperlink"/>
@@ -6210,7 +6427,7 @@
       <w:r>
         <w:t xml:space="preserve">GITHUB. GitHub Docs. Disponível em: </w:t>
       </w:r>
-      <w:hyperlink r:id="rId37" w:history="1">
+      <w:hyperlink r:id="rId38" w:history="1">
         <w:r>
           <w:rPr>
             <w:rStyle w:val="Hyperlink"/>
@@ -6238,7 +6455,7 @@
       <w:r>
         <w:t xml:space="preserve">. Disponível em: </w:t>
       </w:r>
-      <w:hyperlink r:id="rId38" w:history="1">
+      <w:hyperlink r:id="rId39" w:history="1">
         <w:r>
           <w:rPr>
             <w:rStyle w:val="Hyperlink"/>
@@ -6261,15 +6478,20 @@
         <w:ind w:left="708"/>
       </w:pPr>
       <w:r>
-        <w:rPr>
-          <w:lang w:val="en-US"/>
-        </w:rPr>
-        <w:t xml:space="preserve">PYTHON SOFTWARE FOUNDATION. Python Documentation. </w:t>
+        <w:t xml:space="preserve">PYTHON SOFTWARE FOUNDATION. Python </w:t>
+      </w:r>
+      <w:proofErr w:type="spellStart"/>
+      <w:r>
+        <w:t>Documentation</w:t>
+      </w:r>
+      <w:proofErr w:type="spellEnd"/>
+      <w:r>
+        <w:t xml:space="preserve">. </w:t>
       </w:r>
       <w:r>
         <w:t xml:space="preserve">Disponível em: </w:t>
       </w:r>
-      <w:hyperlink r:id="rId39" w:history="1">
+      <w:hyperlink r:id="rId40" w:history="1">
         <w:r>
           <w:rPr>
             <w:rStyle w:val="Hyperlink"/>
@@ -6392,12 +6614,12 @@
     </w:p>
     <w:p/>
     <w:sectPr>
-      <w:headerReference w:type="even" r:id="rId40"/>
-      <w:headerReference w:type="default" r:id="rId41"/>
-      <w:footerReference w:type="even" r:id="rId42"/>
-      <w:footerReference w:type="default" r:id="rId43"/>
-      <w:headerReference w:type="first" r:id="rId44"/>
-      <w:footerReference w:type="first" r:id="rId45"/>
+      <w:headerReference w:type="even" r:id="rId41"/>
+      <w:headerReference w:type="default" r:id="rId42"/>
+      <w:footerReference w:type="even" r:id="rId43"/>
+      <w:footerReference w:type="default" r:id="rId44"/>
+      <w:headerReference w:type="first" r:id="rId45"/>
+      <w:footerReference w:type="first" r:id="rId46"/>
       <w:pgSz w:w="11906" w:h="16838"/>
       <w:pgMar w:top="1417" w:right="1701" w:bottom="1417" w:left="1701" w:header="708" w:footer="708" w:gutter="0"/>
       <w:cols w:space="708"/>
@@ -10287,6 +10509,7 @@
   <w:style w:type="character" w:default="1" w:styleId="Fontepargpadro">
     <w:name w:val="Default Paragraph Font"/>
     <w:uiPriority w:val="1"/>
+    <w:semiHidden/>
     <w:unhideWhenUsed/>
   </w:style>
   <w:style w:type="table" w:default="1" w:styleId="Tabelanormal">

</xml_diff>

<commit_message>
Alteração da imagem na documentação principal.
</commit_message>
<xml_diff>
--- a/02 - Documentação/Documento Principal.docx
+++ b/02 - Documentação/Documento Principal.docx
@@ -292,27 +292,7 @@
           <w:sz w:val="22"/>
           <w:szCs w:val="22"/>
         </w:rPr>
-        <w:t xml:space="preserve">Prof. Giuliano </w:t>
-      </w:r>
-      <w:proofErr w:type="spellStart"/>
-      <w:r>
-        <w:rPr>
-          <w:rFonts w:ascii="Arial" w:eastAsia="Arial" w:hAnsi="Arial" w:cs="Arial"/>
-          <w:color w:val="FFFFFF"/>
-          <w:sz w:val="22"/>
-          <w:szCs w:val="22"/>
-        </w:rPr>
-        <w:t>Lanes</w:t>
-      </w:r>
-      <w:proofErr w:type="spellEnd"/>
-      <w:r>
-        <w:rPr>
-          <w:rFonts w:ascii="Arial" w:eastAsia="Arial" w:hAnsi="Arial" w:cs="Arial"/>
-          <w:color w:val="FFFFFF"/>
-          <w:sz w:val="22"/>
-          <w:szCs w:val="22"/>
-        </w:rPr>
-        <w:t xml:space="preserve"> de Almeida, Esp.</w:t>
+        <w:t>Prof. Giuliano Lanes de Almeida, Esp.</w:t>
       </w:r>
     </w:p>
     <w:p>
@@ -329,47 +309,7 @@
           <w:sz w:val="22"/>
           <w:szCs w:val="22"/>
         </w:rPr>
-        <w:t xml:space="preserve">Profa. Luciane </w:t>
-      </w:r>
-      <w:proofErr w:type="spellStart"/>
-      <w:r>
-        <w:rPr>
-          <w:rFonts w:ascii="Arial" w:eastAsia="Arial" w:hAnsi="Arial" w:cs="Arial"/>
-          <w:color w:val="FFFFFF"/>
-          <w:sz w:val="22"/>
-          <w:szCs w:val="22"/>
-        </w:rPr>
-        <w:t>Yanase</w:t>
-      </w:r>
-      <w:proofErr w:type="spellEnd"/>
-      <w:r>
-        <w:rPr>
-          <w:rFonts w:ascii="Arial" w:eastAsia="Arial" w:hAnsi="Arial" w:cs="Arial"/>
-          <w:color w:val="FFFFFF"/>
-          <w:sz w:val="22"/>
-          <w:szCs w:val="22"/>
-        </w:rPr>
-        <w:t xml:space="preserve"> </w:t>
-      </w:r>
-      <w:proofErr w:type="spellStart"/>
-      <w:r>
-        <w:rPr>
-          <w:rFonts w:ascii="Arial" w:eastAsia="Arial" w:hAnsi="Arial" w:cs="Arial"/>
-          <w:color w:val="FFFFFF"/>
-          <w:sz w:val="22"/>
-          <w:szCs w:val="22"/>
-        </w:rPr>
-        <w:t>Hibara</w:t>
-      </w:r>
-      <w:proofErr w:type="spellEnd"/>
-      <w:r>
-        <w:rPr>
-          <w:rFonts w:ascii="Arial" w:eastAsia="Arial" w:hAnsi="Arial" w:cs="Arial"/>
-          <w:color w:val="FFFFFF"/>
-          <w:sz w:val="22"/>
-          <w:szCs w:val="22"/>
-        </w:rPr>
-        <w:t xml:space="preserve"> Kanashiro, Me.</w:t>
+        <w:t>Profa. Luciane Yanase Hibara Kanashiro, Me.</w:t>
       </w:r>
     </w:p>
     <w:p>
@@ -1611,6 +1551,7 @@
           <w:rFonts w:asciiTheme="minorHAnsi" w:hAnsiTheme="minorHAnsi"/>
           <w:i/>
           <w:iCs/>
+          <w:u w:val="single"/>
         </w:rPr>
       </w:pPr>
       <w:r>
@@ -1751,6 +1692,14 @@
         </w:rPr>
         <w:t>RF001 - Acesso à aplicação. Home em resolução mobile</w:t>
       </w:r>
+      <w:r>
+        <w:rPr>
+          <w:rFonts w:asciiTheme="minorHAnsi" w:hAnsiTheme="minorHAnsi"/>
+          <w:i/>
+          <w:iCs/>
+        </w:rPr>
+        <w:t>.</w:t>
+      </w:r>
     </w:p>
     <w:p>
       <w:pPr>
@@ -1874,18 +1823,8 @@
           <w:i/>
           <w:iCs/>
         </w:rPr>
-        <w:t xml:space="preserve">RF002 - Realizar </w:t>
-      </w:r>
-      <w:proofErr w:type="spellStart"/>
-      <w:r>
-        <w:rPr>
-          <w:rFonts w:asciiTheme="minorHAnsi" w:hAnsiTheme="minorHAnsi"/>
-          <w:i/>
-          <w:iCs/>
-        </w:rPr>
-        <w:t>pedido_Botão_FinalizarPedido</w:t>
-      </w:r>
-      <w:proofErr w:type="spellEnd"/>
+        <w:t>RF002 - Realizar pedido_Botão_FinalizarPedido</w:t>
+      </w:r>
       <w:r>
         <w:rPr>
           <w:rFonts w:asciiTheme="minorHAnsi" w:hAnsiTheme="minorHAnsi"/>
@@ -2578,15 +2517,7 @@
       </w:pPr>
       <w:r>
         <w:lastRenderedPageBreak/>
-        <w:t>O Raízes App utiliza uma arquitetura dividida em três componentes principais: Front-</w:t>
-      </w:r>
-      <w:proofErr w:type="spellStart"/>
-      <w:r>
-        <w:t>end</w:t>
-      </w:r>
-      <w:proofErr w:type="spellEnd"/>
-      <w:r>
-        <w:t>, API e banco de dados. Essa organização permite separar a interface apresentada ao usuário das regras de processamento e do armazenamento das informações.</w:t>
+        <w:t>O Raízes App utiliza uma arquitetura dividida em três componentes principais: Front-end, API e banco de dados. Essa organização permite separar a interface apresentada ao usuário das regras de processamento e do armazenamento das informações.</w:t>
       </w:r>
     </w:p>
     <w:p>
@@ -2605,27 +2536,10 @@
           <w:b/>
           <w:bCs/>
         </w:rPr>
-        <w:t>Front-</w:t>
-      </w:r>
-      <w:proofErr w:type="spellStart"/>
-      <w:r>
-        <w:rPr>
-          <w:b/>
-          <w:bCs/>
-        </w:rPr>
-        <w:t>end</w:t>
-      </w:r>
-      <w:proofErr w:type="spellEnd"/>
-      <w:r>
-        <w:t xml:space="preserve"> foi desenvolvido com HTML, CSS e </w:t>
-      </w:r>
-      <w:proofErr w:type="spellStart"/>
-      <w:r>
-        <w:t>JavaScript</w:t>
-      </w:r>
-      <w:proofErr w:type="spellEnd"/>
-      <w:r>
-        <w:t>, sendo responsável pela apresentação das telas e pela interação com o cliente durante o processo de realização do pedido.</w:t>
+        <w:t>Front-end</w:t>
+      </w:r>
+      <w:r>
+        <w:t xml:space="preserve"> foi desenvolvido com HTML, CSS e JavaScript, sendo responsável pela apresentação das telas e pela interação com o cliente durante o processo de realização do pedido.</w:t>
       </w:r>
     </w:p>
     <w:p>
@@ -2647,15 +2561,7 @@
         <w:t>API</w:t>
       </w:r>
       <w:r>
-        <w:t xml:space="preserve"> foi desenvolvida em Python, utilizando o framework </w:t>
-      </w:r>
-      <w:proofErr w:type="spellStart"/>
-      <w:r>
-        <w:t>Flask</w:t>
-      </w:r>
-      <w:proofErr w:type="spellEnd"/>
-      <w:r>
-        <w:t>. Sua função é receber as requisições realizadas pela aplicação web, validar os dados e realizar as operações necessárias no banco de dados.</w:t>
+        <w:t xml:space="preserve"> foi desenvolvida em Python, utilizando o framework Flask. Sua função é receber as requisições realizadas pela aplicação web, validar os dados e realizar as operações necessárias no banco de dados.</w:t>
       </w:r>
     </w:p>
     <w:p>
@@ -2741,21 +2647,12 @@
           <w:numId w:val="3"/>
         </w:numPr>
       </w:pPr>
-      <w:proofErr w:type="spellStart"/>
-      <w:r>
-        <w:rPr>
-          <w:b/>
-          <w:bCs/>
-        </w:rPr>
-        <w:t>JavaScript</w:t>
-      </w:r>
-      <w:proofErr w:type="spellEnd"/>
-      <w:r>
-        <w:rPr>
-          <w:b/>
-          <w:bCs/>
-        </w:rPr>
-        <w:t>:</w:t>
+      <w:r>
+        <w:rPr>
+          <w:b/>
+          <w:bCs/>
+        </w:rPr>
+        <w:t>JavaScript:</w:t>
       </w:r>
       <w:r>
         <w:t xml:space="preserve"> implementação das interações e comunicação com a API.</w:t>
@@ -2773,23 +2670,7 @@
           <w:b/>
           <w:bCs/>
         </w:rPr>
-        <w:t xml:space="preserve">Python e </w:t>
-      </w:r>
-      <w:proofErr w:type="spellStart"/>
-      <w:r>
-        <w:rPr>
-          <w:b/>
-          <w:bCs/>
-        </w:rPr>
-        <w:t>Flask</w:t>
-      </w:r>
-      <w:proofErr w:type="spellEnd"/>
-      <w:r>
-        <w:rPr>
-          <w:b/>
-          <w:bCs/>
-        </w:rPr>
-        <w:t>:</w:t>
+        <w:t>Python e Flask:</w:t>
       </w:r>
       <w:r>
         <w:t xml:space="preserve"> desenvolvimento da API.</w:t>
@@ -2802,21 +2683,12 @@
           <w:numId w:val="3"/>
         </w:numPr>
       </w:pPr>
-      <w:proofErr w:type="spellStart"/>
-      <w:r>
-        <w:rPr>
-          <w:b/>
-          <w:bCs/>
-        </w:rPr>
-        <w:t>Flask</w:t>
-      </w:r>
-      <w:proofErr w:type="spellEnd"/>
-      <w:r>
-        <w:rPr>
-          <w:b/>
-          <w:bCs/>
-        </w:rPr>
-        <w:t>-CORS:</w:t>
+      <w:r>
+        <w:rPr>
+          <w:b/>
+          <w:bCs/>
+        </w:rPr>
+        <w:t>Flask-CORS:</w:t>
       </w:r>
       <w:r>
         <w:t xml:space="preserve"> configuração do acesso entre a aplicação web e a API.</w:t>
@@ -2829,21 +2701,12 @@
           <w:numId w:val="3"/>
         </w:numPr>
       </w:pPr>
-      <w:proofErr w:type="spellStart"/>
-      <w:r>
-        <w:rPr>
-          <w:b/>
-          <w:bCs/>
-        </w:rPr>
-        <w:t>PyODBC</w:t>
-      </w:r>
-      <w:proofErr w:type="spellEnd"/>
-      <w:r>
-        <w:rPr>
-          <w:b/>
-          <w:bCs/>
-        </w:rPr>
-        <w:t>:</w:t>
+      <w:r>
+        <w:rPr>
+          <w:b/>
+          <w:bCs/>
+        </w:rPr>
+        <w:t>PyODBC:</w:t>
       </w:r>
       <w:r>
         <w:t xml:space="preserve"> comunicação entre a API e o banco de dados.</w:t>
@@ -2874,21 +2737,12 @@
           <w:numId w:val="3"/>
         </w:numPr>
       </w:pPr>
-      <w:proofErr w:type="spellStart"/>
-      <w:r>
-        <w:rPr>
-          <w:b/>
-          <w:bCs/>
-        </w:rPr>
-        <w:t>Git</w:t>
-      </w:r>
-      <w:proofErr w:type="spellEnd"/>
-      <w:r>
-        <w:rPr>
-          <w:b/>
-          <w:bCs/>
-        </w:rPr>
-        <w:t xml:space="preserve"> e GitHub:</w:t>
+      <w:r>
+        <w:rPr>
+          <w:b/>
+          <w:bCs/>
+        </w:rPr>
+        <w:t>Git e GitHub:</w:t>
       </w:r>
       <w:r>
         <w:t xml:space="preserve"> versionamento e disponibilização do código-fonte.</w:t>
@@ -2942,7 +2796,6 @@
           <w:numId w:val="4"/>
         </w:numPr>
       </w:pPr>
-      <w:proofErr w:type="spellStart"/>
       <w:r>
         <w:rPr>
           <w:b/>
@@ -2964,7 +2817,6 @@
         </w:rPr>
         <w:t>rio</w:t>
       </w:r>
-      <w:proofErr w:type="spellEnd"/>
       <w:r>
         <w:rPr>
           <w:b/>
@@ -3037,21 +2889,12 @@
           <w:numId w:val="4"/>
         </w:numPr>
       </w:pPr>
-      <w:proofErr w:type="spellStart"/>
-      <w:r>
-        <w:rPr>
-          <w:b/>
-          <w:bCs/>
-        </w:rPr>
-        <w:t>ItemPedido</w:t>
-      </w:r>
-      <w:proofErr w:type="spellEnd"/>
-      <w:r>
-        <w:rPr>
-          <w:b/>
-          <w:bCs/>
-        </w:rPr>
-        <w:t>:</w:t>
+      <w:r>
+        <w:rPr>
+          <w:b/>
+          <w:bCs/>
+        </w:rPr>
+        <w:t>ItemPedido:</w:t>
       </w:r>
       <w:r>
         <w:t xml:space="preserve"> registra os produtos que compõem cada pedido, suas quantidades e preços unitários.</w:t>
@@ -3090,23 +2933,7 @@
         </w:numPr>
       </w:pPr>
       <w:r>
-        <w:t>Durante a execução local, o Front-</w:t>
-      </w:r>
-      <w:proofErr w:type="spellStart"/>
-      <w:r>
-        <w:t>end</w:t>
-      </w:r>
-      <w:proofErr w:type="spellEnd"/>
-      <w:r>
-        <w:t xml:space="preserve"> envia requisições à API </w:t>
-      </w:r>
-      <w:proofErr w:type="spellStart"/>
-      <w:r>
-        <w:t>Flask</w:t>
-      </w:r>
-      <w:proofErr w:type="spellEnd"/>
-      <w:r>
-        <w:t>. A API processa as solicitações, realiza as validações necessárias e acessa o banco de dados SQL Server para consultar ou registrar informações.</w:t>
+        <w:t>Durante a execução local, o Front-end envia requisições à API Flask. A API processa as solicitações, realiza as validações necessárias e acessa o banco de dados SQL Server para consultar ou registrar informações.</w:t>
       </w:r>
     </w:p>
     <w:p>
@@ -3130,15 +2957,7 @@
         </w:numPr>
       </w:pPr>
       <w:r>
-        <w:t>A publicação do Front-</w:t>
-      </w:r>
-      <w:proofErr w:type="spellStart"/>
-      <w:r>
-        <w:t>end</w:t>
-      </w:r>
-      <w:proofErr w:type="spellEnd"/>
-      <w:r>
-        <w:t xml:space="preserve"> no GitHub Pages permite visualizar a interface pela internet. Entretanto, a API e o banco de dados permanecem configurados para execução local, de modo que a operação completa do sistema depende da execução desses componentes no ambiente de desenvolvimento.</w:t>
+        <w:t>A publicação do Front-end no GitHub Pages permite visualizar a interface pela internet. Entretanto, a API e o banco de dados permanecem configurados para execução local, de modo que a operação completa do sistema depende da execução desses componentes no ambiente de desenvolvimento.</w:t>
       </w:r>
       <w:r>
         <w:t xml:space="preserve"> </w:t>
@@ -3190,18 +3009,9 @@
           <w:b/>
           <w:bCs/>
         </w:rPr>
-        <w:t>5.1 Desenvolvimento do Front-</w:t>
-      </w:r>
-      <w:proofErr w:type="spellStart"/>
-      <w:r>
-        <w:rPr>
-          <w:b/>
-          <w:bCs/>
-        </w:rPr>
-        <w:t>end</w:t>
+        <w:t>5.1 Desenvolvimento do Front-end</w:t>
       </w:r>
       <w:bookmarkEnd w:id="14"/>
-      <w:proofErr w:type="spellEnd"/>
     </w:p>
     <w:p>
       <w:pPr>
@@ -3212,23 +3022,7 @@
         </w:numPr>
       </w:pPr>
       <w:r>
-        <w:t>O Front-</w:t>
-      </w:r>
-      <w:proofErr w:type="spellStart"/>
-      <w:r>
-        <w:t>end</w:t>
-      </w:r>
-      <w:proofErr w:type="spellEnd"/>
-      <w:r>
-        <w:t xml:space="preserve"> do Raízes App foi desenvolvido utilizando HTML, CSS e </w:t>
-      </w:r>
-      <w:proofErr w:type="spellStart"/>
-      <w:r>
-        <w:t>JavaScript</w:t>
-      </w:r>
-      <w:proofErr w:type="spellEnd"/>
-      <w:r>
-        <w:t>. A interface permite que o cliente acesse a página inicial, selecione uma unidade, consulte o cardápio, visualize os produtos e organize seu pedido.</w:t>
+        <w:t>O Front-end do Raízes App foi desenvolvido utilizando HTML, CSS e JavaScript. A interface permite que o cliente acesse a página inicial, selecione uma unidade, consulte o cardápio, visualize os produtos e organize seu pedido.</w:t>
       </w:r>
     </w:p>
     <w:p>
@@ -3270,23 +3064,7 @@
         </w:numPr>
       </w:pPr>
       <w:r>
-        <w:t xml:space="preserve">A API foi desenvolvida em Python, utilizando o framework </w:t>
-      </w:r>
-      <w:proofErr w:type="spellStart"/>
-      <w:r>
-        <w:t>Flask</w:t>
-      </w:r>
-      <w:proofErr w:type="spellEnd"/>
-      <w:r>
-        <w:t>, e é responsável por intermediar a comunicação entre o Front-</w:t>
-      </w:r>
-      <w:proofErr w:type="spellStart"/>
-      <w:r>
-        <w:t>end</w:t>
-      </w:r>
-      <w:proofErr w:type="spellEnd"/>
-      <w:r>
-        <w:t xml:space="preserve"> e o banco de dados.</w:t>
+        <w:t>A API foi desenvolvida em Python, utilizando o framework Flask, e é responsável por intermediar a comunicação entre o Front-end e o banco de dados.</w:t>
       </w:r>
     </w:p>
     <w:p>
@@ -3712,38 +3490,7 @@
           <w:sz w:val="22"/>
           <w:szCs w:val="22"/>
         </w:rPr>
-        <w:t xml:space="preserve">CT002 </w:t>
-      </w:r>
-      <w:proofErr w:type="gramStart"/>
-      <w:r>
-        <w:rPr>
-          <w:i/>
-          <w:iCs/>
-          <w:sz w:val="22"/>
-          <w:szCs w:val="22"/>
-        </w:rPr>
-        <w:t xml:space="preserve">–  </w:t>
-      </w:r>
-      <w:proofErr w:type="spellStart"/>
-      <w:r>
-        <w:rPr>
-          <w:i/>
-          <w:iCs/>
-          <w:sz w:val="22"/>
-          <w:szCs w:val="22"/>
-        </w:rPr>
-        <w:t>IdUnidade</w:t>
-      </w:r>
-      <w:proofErr w:type="spellEnd"/>
-      <w:proofErr w:type="gramEnd"/>
-      <w:r>
-        <w:rPr>
-          <w:i/>
-          <w:iCs/>
-          <w:sz w:val="22"/>
-          <w:szCs w:val="22"/>
-        </w:rPr>
-        <w:t xml:space="preserve"> Obrigatório</w:t>
+        <w:t>CT002 –  IdUnidade Obrigatório</w:t>
       </w:r>
       <w:r>
         <w:rPr>
@@ -5560,6 +5307,15 @@
           <w:sz w:val="22"/>
           <w:szCs w:val="22"/>
         </w:rPr>
+        <w:t>.</w:t>
+      </w:r>
+      <w:r>
+        <w:rPr>
+          <w:i/>
+          <w:iCs/>
+          <w:sz w:val="22"/>
+          <w:szCs w:val="22"/>
+        </w:rPr>
         <w:br/>
       </w:r>
     </w:p>
@@ -5632,63 +5388,7 @@
         </w:rPr>
         <w:lastRenderedPageBreak/>
         <w:drawing>
-          <wp:inline distT="0" distB="0" distL="0" distR="0" wp14:anchorId="1597E762" wp14:editId="3445AD2A">
-            <wp:extent cx="4152900" cy="2613660"/>
-            <wp:effectExtent l="0" t="0" r="0" b="0"/>
-            <wp:docPr id="1693441331" name="Imagem 9"/>
-            <wp:cNvGraphicFramePr>
-              <a:graphicFrameLocks xmlns:a="http://schemas.openxmlformats.org/drawingml/2006/main" noChangeAspect="1"/>
-            </wp:cNvGraphicFramePr>
-            <a:graphic xmlns:a="http://schemas.openxmlformats.org/drawingml/2006/main">
-              <a:graphicData uri="http://schemas.openxmlformats.org/drawingml/2006/picture">
-                <pic:pic xmlns:pic="http://schemas.openxmlformats.org/drawingml/2006/picture">
-                  <pic:nvPicPr>
-                    <pic:cNvPr id="0" name="Picture 10"/>
-                    <pic:cNvPicPr>
-                      <a:picLocks noChangeAspect="1" noChangeArrowheads="1"/>
-                    </pic:cNvPicPr>
-                  </pic:nvPicPr>
-                  <pic:blipFill>
-                    <a:blip r:embed="rId30">
-                      <a:extLst>
-                        <a:ext uri="{28A0092B-C50C-407E-A947-70E740481C1C}">
-                          <a14:useLocalDpi xmlns:a14="http://schemas.microsoft.com/office/drawing/2010/main" val="0"/>
-                        </a:ext>
-                      </a:extLst>
-                    </a:blip>
-                    <a:srcRect/>
-                    <a:stretch>
-                      <a:fillRect/>
-                    </a:stretch>
-                  </pic:blipFill>
-                  <pic:spPr bwMode="auto">
-                    <a:xfrm>
-                      <a:off x="0" y="0"/>
-                      <a:ext cx="4152900" cy="2613660"/>
-                    </a:xfrm>
-                    <a:prstGeom prst="rect">
-                      <a:avLst/>
-                    </a:prstGeom>
-                    <a:noFill/>
-                    <a:ln>
-                      <a:noFill/>
-                    </a:ln>
-                  </pic:spPr>
-                </pic:pic>
-              </a:graphicData>
-            </a:graphic>
-          </wp:inline>
-        </w:drawing>
-      </w:r>
-      <w:r>
-        <w:br/>
-      </w:r>
-      <w:r>
-        <w:rPr>
-          <w:noProof/>
-        </w:rPr>
-        <w:drawing>
-          <wp:inline distT="0" distB="0" distL="0" distR="0" wp14:anchorId="362FEC82" wp14:editId="18E00173">
+          <wp:inline distT="0" distB="0" distL="0" distR="0" wp14:anchorId="033802D0" wp14:editId="16D0851C">
             <wp:extent cx="4937760" cy="2987040"/>
             <wp:effectExtent l="0" t="0" r="0" b="3810"/>
             <wp:docPr id="1200638035" name="Imagem 10"/>
@@ -5705,7 +5405,7 @@
                     </pic:cNvPicPr>
                   </pic:nvPicPr>
                   <pic:blipFill>
-                    <a:blip r:embed="rId31">
+                    <a:blip r:embed="rId30">
                       <a:extLst>
                         <a:ext uri="{28A0092B-C50C-407E-A947-70E740481C1C}">
                           <a14:useLocalDpi xmlns:a14="http://schemas.microsoft.com/office/drawing/2010/main" val="0"/>
@@ -5741,8 +5441,114 @@
       </w:r>
       <w:r>
         <w:rPr>
+          <w:i/>
+          <w:iCs/>
+        </w:rPr>
+        <w:t>Fluxo_Pedido_Gravado_Banco</w:t>
+      </w:r>
+      <w:r>
+        <w:t>.</w:t>
+      </w:r>
+      <w:r>
+        <w:br/>
+      </w:r>
+    </w:p>
+    <w:p>
+      <w:pPr>
+        <w:pStyle w:val="PargrafodaLista"/>
+      </w:pPr>
+      <w:r>
+        <w:rPr>
           <w:noProof/>
         </w:rPr>
+        <w:drawing>
+          <wp:inline distT="0" distB="0" distL="0" distR="0" wp14:anchorId="1F976FF9" wp14:editId="2EDB0109">
+            <wp:extent cx="4739640" cy="2994660"/>
+            <wp:effectExtent l="0" t="0" r="3810" b="0"/>
+            <wp:docPr id="653103101" name="Imagem 2"/>
+            <wp:cNvGraphicFramePr>
+              <a:graphicFrameLocks xmlns:a="http://schemas.openxmlformats.org/drawingml/2006/main" noChangeAspect="1"/>
+            </wp:cNvGraphicFramePr>
+            <a:graphic xmlns:a="http://schemas.openxmlformats.org/drawingml/2006/main">
+              <a:graphicData uri="http://schemas.openxmlformats.org/drawingml/2006/picture">
+                <pic:pic xmlns:pic="http://schemas.openxmlformats.org/drawingml/2006/picture">
+                  <pic:nvPicPr>
+                    <pic:cNvPr id="0" name="Picture 2"/>
+                    <pic:cNvPicPr>
+                      <a:picLocks noChangeAspect="1" noChangeArrowheads="1"/>
+                    </pic:cNvPicPr>
+                  </pic:nvPicPr>
+                  <pic:blipFill>
+                    <a:blip r:embed="rId31">
+                      <a:extLst>
+                        <a:ext uri="{28A0092B-C50C-407E-A947-70E740481C1C}">
+                          <a14:useLocalDpi xmlns:a14="http://schemas.microsoft.com/office/drawing/2010/main" val="0"/>
+                        </a:ext>
+                      </a:extLst>
+                    </a:blip>
+                    <a:srcRect/>
+                    <a:stretch>
+                      <a:fillRect/>
+                    </a:stretch>
+                  </pic:blipFill>
+                  <pic:spPr bwMode="auto">
+                    <a:xfrm>
+                      <a:off x="0" y="0"/>
+                      <a:ext cx="4739640" cy="2994660"/>
+                    </a:xfrm>
+                    <a:prstGeom prst="rect">
+                      <a:avLst/>
+                    </a:prstGeom>
+                    <a:noFill/>
+                    <a:ln>
+                      <a:noFill/>
+                    </a:ln>
+                  </pic:spPr>
+                </pic:pic>
+              </a:graphicData>
+            </a:graphic>
+          </wp:inline>
+        </w:drawing>
+      </w:r>
+      <w:r>
+        <w:br/>
+      </w:r>
+      <w:r>
+        <w:rPr>
+          <w:i/>
+          <w:iCs/>
+        </w:rPr>
+        <w:t>Fluxo_ItemPedido_Gravado_Banco</w:t>
+      </w:r>
+      <w:r>
+        <w:rPr>
+          <w:i/>
+          <w:iCs/>
+        </w:rPr>
+        <w:t>.</w:t>
+      </w:r>
+      <w:r>
+        <w:br/>
+      </w:r>
+      <w:r>
+        <w:br/>
+      </w:r>
+    </w:p>
+    <w:p>
+      <w:pPr>
+        <w:pStyle w:val="PargrafodaLista"/>
+      </w:pPr>
+      <w:r>
+        <w:br/>
+      </w:r>
+      <w:r>
+        <w:br/>
+      </w:r>
+      <w:r>
+        <w:rPr>
+          <w:noProof/>
+        </w:rPr>
+        <w:lastRenderedPageBreak/>
         <w:drawing>
           <wp:inline distT="0" distB="0" distL="0" distR="0" wp14:anchorId="54FFFB6E" wp14:editId="237619B9">
             <wp:extent cx="5394960" cy="1844040"/>
@@ -5797,14 +5603,35 @@
       </w:r>
       <w:r>
         <w:rPr>
+          <w:i/>
+          <w:iCs/>
+        </w:rPr>
+        <w:t>Fluxo_Pedido_Vazio_Bloqueado</w:t>
+      </w:r>
+      <w:r>
+        <w:rPr>
+          <w:i/>
+          <w:iCs/>
+        </w:rPr>
+        <w:t>.</w:t>
+      </w:r>
+    </w:p>
+    <w:p>
+      <w:pPr>
+        <w:pStyle w:val="PargrafodaLista"/>
+      </w:pPr>
+      <w:r>
+        <w:br/>
+      </w:r>
+      <w:r>
+        <w:rPr>
           <w:noProof/>
         </w:rPr>
-        <w:lastRenderedPageBreak/>
         <w:drawing>
-          <wp:inline distT="0" distB="0" distL="0" distR="0" wp14:anchorId="7643039E" wp14:editId="0B81BAB2">
-            <wp:extent cx="4937760" cy="2987040"/>
-            <wp:effectExtent l="0" t="0" r="0" b="3810"/>
-            <wp:docPr id="642656638" name="Imagem 12"/>
+          <wp:inline distT="0" distB="0" distL="0" distR="0" wp14:anchorId="0677A656" wp14:editId="20A30F88">
+            <wp:extent cx="5303520" cy="2743200"/>
+            <wp:effectExtent l="0" t="0" r="0" b="0"/>
+            <wp:docPr id="1759160327" name="Imagem 3"/>
             <wp:cNvGraphicFramePr>
               <a:graphicFrameLocks xmlns:a="http://schemas.openxmlformats.org/drawingml/2006/main" noChangeAspect="1"/>
             </wp:cNvGraphicFramePr>
@@ -5812,13 +5639,13 @@
               <a:graphicData uri="http://schemas.openxmlformats.org/drawingml/2006/picture">
                 <pic:pic xmlns:pic="http://schemas.openxmlformats.org/drawingml/2006/picture">
                   <pic:nvPicPr>
-                    <pic:cNvPr id="0" name="Picture 13"/>
+                    <pic:cNvPr id="0" name="Picture 3"/>
                     <pic:cNvPicPr>
                       <a:picLocks noChangeAspect="1" noChangeArrowheads="1"/>
                     </pic:cNvPicPr>
                   </pic:nvPicPr>
                   <pic:blipFill>
-                    <a:blip r:embed="rId31">
+                    <a:blip r:embed="rId33">
                       <a:extLst>
                         <a:ext uri="{28A0092B-C50C-407E-A947-70E740481C1C}">
                           <a14:useLocalDpi xmlns:a14="http://schemas.microsoft.com/office/drawing/2010/main" val="0"/>
@@ -5833,7 +5660,7 @@
                   <pic:spPr bwMode="auto">
                     <a:xfrm>
                       <a:off x="0" y="0"/>
-                      <a:ext cx="4937760" cy="2987040"/>
+                      <a:ext cx="5303520" cy="2743200"/>
                     </a:xfrm>
                     <a:prstGeom prst="rect">
                       <a:avLst/>
@@ -5852,6 +5679,16 @@
       <w:r>
         <w:br/>
       </w:r>
+      <w:r>
+        <w:rPr>
+          <w:i/>
+          <w:iCs/>
+        </w:rPr>
+        <w:t>Fluxo_Pedido_Vazio_Nao_Gravado_Banco.</w:t>
+      </w:r>
+      <w:r>
+        <w:br/>
+      </w:r>
     </w:p>
     <w:p>
       <w:pPr>
@@ -5940,7 +5777,11 @@
         </w:numPr>
       </w:pPr>
       <w:r>
-        <w:t>Os testes realizados concentraram-se nas funcionalidades implementadas e nos cenários validados durante o desenvolvimento local. Testes abrangentes de desempenho, disponibilidade, segurança e comportamento sob grande volume de acessos não foram considerados concluídos apenas com essas verificações.</w:t>
+        <w:t xml:space="preserve">Os testes realizados concentraram-se nas funcionalidades implementadas e nos cenários validados durante o desenvolvimento local. Testes abrangentes de desempenho, disponibilidade, segurança e </w:t>
+      </w:r>
+      <w:r>
+        <w:lastRenderedPageBreak/>
+        <w:t>comportamento sob grande volume de acessos não foram considerados concluídos apenas com essas verificações.</w:t>
       </w:r>
     </w:p>
     <w:p>
@@ -5987,15 +5828,7 @@
         <w:ind w:left="708"/>
       </w:pPr>
       <w:r>
-        <w:t>A aplicação Raízes do Nordeste foi desenvolvida utilizando uma arquitetura composta por Front-</w:t>
-      </w:r>
-      <w:proofErr w:type="spellStart"/>
-      <w:r>
-        <w:t>end</w:t>
-      </w:r>
-      <w:proofErr w:type="spellEnd"/>
-      <w:r>
-        <w:t>, API e banco de dados, permitindo a separação das responsabilidades entre as diferentes camadas do sistema.</w:t>
+        <w:t>A aplicação Raízes do Nordeste foi desenvolvida utilizando uma arquitetura composta por Front-end, API e banco de dados, permitindo a separação das responsabilidades entre as diferentes camadas do sistema.</w:t>
       </w:r>
     </w:p>
     <w:p>
@@ -6007,29 +5840,12 @@
           <w:b/>
           <w:bCs/>
         </w:rPr>
-        <w:lastRenderedPageBreak/>
-        <w:t>Acesso ao front-</w:t>
-      </w:r>
-      <w:proofErr w:type="spellStart"/>
-      <w:r>
-        <w:rPr>
-          <w:b/>
-          <w:bCs/>
-        </w:rPr>
-        <w:t>end</w:t>
-      </w:r>
-      <w:proofErr w:type="spellEnd"/>
-      <w:r>
-        <w:rPr>
-          <w:b/>
-          <w:bCs/>
-        </w:rPr>
-        <w:t>:</w:t>
+        <w:t>Acesso ao front-end:</w:t>
       </w:r>
       <w:r>
         <w:br/>
       </w:r>
-      <w:hyperlink r:id="rId33" w:history="1">
+      <w:hyperlink r:id="rId34" w:history="1">
         <w:r>
           <w:rPr>
             <w:rStyle w:val="Hyperlink"/>
@@ -6052,7 +5868,7 @@
       <w:r>
         <w:br/>
       </w:r>
-      <w:hyperlink r:id="rId34" w:history="1">
+      <w:hyperlink r:id="rId35" w:history="1">
         <w:r>
           <w:rPr>
             <w:rStyle w:val="Hyperlink"/>
@@ -6070,28 +5886,12 @@
           <w:b/>
           <w:bCs/>
         </w:rPr>
-        <w:t xml:space="preserve">Protótipo da interface no </w:t>
-      </w:r>
-      <w:proofErr w:type="spellStart"/>
-      <w:r>
-        <w:rPr>
-          <w:b/>
-          <w:bCs/>
-        </w:rPr>
-        <w:t>Figma</w:t>
-      </w:r>
-      <w:proofErr w:type="spellEnd"/>
-      <w:r>
-        <w:rPr>
-          <w:b/>
-          <w:bCs/>
-        </w:rPr>
-        <w:t>:</w:t>
+        <w:t>Protótipo da interface no Figma:</w:t>
       </w:r>
       <w:r>
         <w:br/>
       </w:r>
-      <w:hyperlink r:id="rId35" w:history="1">
+      <w:hyperlink r:id="rId36" w:history="1">
         <w:r>
           <w:rPr>
             <w:rStyle w:val="Hyperlink"/>
@@ -6108,15 +5908,7 @@
         </w:rPr>
       </w:pPr>
       <w:r>
-        <w:t xml:space="preserve">O protótipo foi elaborado no </w:t>
-      </w:r>
-      <w:proofErr w:type="spellStart"/>
-      <w:r>
-        <w:t>Figma</w:t>
-      </w:r>
-      <w:proofErr w:type="spellEnd"/>
-      <w:r>
-        <w:t xml:space="preserve"> para apoiar o planejamento visual da aplicação e a organização das telas e dos fluxos de navegação do Raízes App. Ele permite consultar a proposta visual desenvolvida durante a etapa de prototipação.</w:t>
+        <w:t>O protótipo foi elaborado no Figma para apoiar o planejamento visual da aplicação e a organização das telas e dos fluxos de navegação do Raízes App. Ele permite consultar a proposta visual desenvolvida durante a etapa de prototipação.</w:t>
       </w:r>
     </w:p>
     <w:p>
@@ -6124,23 +5916,7 @@
         <w:ind w:left="708"/>
       </w:pPr>
       <w:r>
-        <w:t>O Front-</w:t>
-      </w:r>
-      <w:proofErr w:type="spellStart"/>
-      <w:r>
-        <w:t>end</w:t>
-      </w:r>
-      <w:proofErr w:type="spellEnd"/>
-      <w:r>
-        <w:t xml:space="preserve"> foi desenvolvido utilizando HTML, CSS e </w:t>
-      </w:r>
-      <w:proofErr w:type="spellStart"/>
-      <w:r>
-        <w:t>JavaScript</w:t>
-      </w:r>
-      <w:proofErr w:type="spellEnd"/>
-      <w:r>
-        <w:t xml:space="preserve">, sendo disponibilizado por meio do GitHub Pages. O código-fonte completo do projeto também foi disponibilizado em um repositório público no GitHub, contendo os arquivos relacionados à </w:t>
+        <w:t xml:space="preserve">O Front-end foi desenvolvido utilizando HTML, CSS e JavaScript, sendo disponibilizado por meio do GitHub Pages. O código-fonte completo do projeto também foi disponibilizado em um repositório público no GitHub, contendo os arquivos relacionados à </w:t>
       </w:r>
       <w:r>
         <w:rPr>
@@ -6149,15 +5925,7 @@
         <w:t>documentação</w:t>
       </w:r>
       <w:r>
-        <w:t>, requisitos, protótipos, banco de dados, API, Front-</w:t>
-      </w:r>
-      <w:proofErr w:type="spellStart"/>
-      <w:r>
-        <w:t>end</w:t>
-      </w:r>
-      <w:proofErr w:type="spellEnd"/>
-      <w:r>
-        <w:t>, testes e evidências.</w:t>
+        <w:t>, requisitos, protótipos, banco de dados, API, Front-end, testes e evidências.</w:t>
       </w:r>
     </w:p>
     <w:p>
@@ -6165,15 +5933,7 @@
         <w:ind w:left="708"/>
       </w:pPr>
       <w:r>
-        <w:t xml:space="preserve">A API foi desenvolvida utilizando Python e </w:t>
-      </w:r>
-      <w:proofErr w:type="spellStart"/>
-      <w:r>
-        <w:t>Flask</w:t>
-      </w:r>
-      <w:proofErr w:type="spellEnd"/>
-      <w:r>
-        <w:t>, sendo responsável pela comunicação entre a aplicação e o banco de dados. Para o desenvolvimento e validação do sistema, a API foi executada em ambiente local.</w:t>
+        <w:t>A API foi desenvolvida utilizando Python e Flask, sendo responsável pela comunicação entre a aplicação e o banco de dados. Para o desenvolvimento e validação do sistema, a API foi executada em ambiente local.</w:t>
       </w:r>
     </w:p>
     <w:p>
@@ -6189,15 +5949,11 @@
         <w:ind w:left="708"/>
       </w:pPr>
       <w:r>
-        <w:t>Durante o desenvolvimento, a aplicação foi testada em ambiente local, permitindo validar a comunicação entre o Front-</w:t>
-      </w:r>
-      <w:proofErr w:type="spellStart"/>
-      <w:r>
-        <w:t>end</w:t>
-      </w:r>
-      <w:proofErr w:type="spellEnd"/>
-      <w:r>
-        <w:t>, a API e o banco de dados, bem como executar os testes funcionais e registrar as respectivas evidências.</w:t>
+        <w:t xml:space="preserve">Durante o desenvolvimento, a aplicação foi testada em ambiente local, permitindo validar a comunicação entre o Front-end, a API e o banco de </w:t>
+      </w:r>
+      <w:r>
+        <w:lastRenderedPageBreak/>
+        <w:t>dados, bem como executar os testes funcionais e registrar as respectivas evidências.</w:t>
       </w:r>
     </w:p>
     <w:p>
@@ -6205,15 +5961,7 @@
         <w:ind w:left="708"/>
       </w:pPr>
       <w:r>
-        <w:t xml:space="preserve">Para a disponibilização completa da aplicação em um ambiente externo, permitindo que usuários e avaliadores acessem todas as funcionalidades por meio da internet, é necessária a configuração de um ambiente de hospedagem para a API e para o banco de dados. Essa etapa envolve a disponibilização da API </w:t>
-      </w:r>
-      <w:proofErr w:type="spellStart"/>
-      <w:r>
-        <w:t>Flask</w:t>
-      </w:r>
-      <w:proofErr w:type="spellEnd"/>
-      <w:r>
-        <w:t xml:space="preserve"> em um servidor acessível externamente e a configuração do banco de dados em uma infraestrutura compatível.</w:t>
+        <w:t>Para a disponibilização completa da aplicação em um ambiente externo, permitindo que usuários e avaliadores acessem todas as funcionalidades por meio da internet, é necessária a configuração de um ambiente de hospedagem para a API e para o banco de dados. Essa etapa envolve a disponibilização da API Flask em um servidor acessível externamente e a configuração do banco de dados em uma infraestrutura compatível.</w:t>
       </w:r>
     </w:p>
     <w:p>
@@ -6221,11 +5969,7 @@
         <w:ind w:left="708"/>
       </w:pPr>
       <w:r>
-        <w:t xml:space="preserve">Dessa forma, o projeto apresenta a implementação das principais funcionalidades do sistema, além da documentação da arquitetura, dos </w:t>
-      </w:r>
-      <w:r>
-        <w:lastRenderedPageBreak/>
-        <w:t>requisitos, dos testes realizados e das condições necessárias para sua implantação em ambiente de produção.</w:t>
+        <w:t>Dessa forma, o projeto apresenta a implementação das principais funcionalidades do sistema, além da documentação da arquitetura, dos requisitos, dos testes realizados e das condições necessárias para sua implantação em ambiente de produção.</w:t>
       </w:r>
     </w:p>
     <w:p>
@@ -6284,31 +6028,7 @@
         <w:ind w:left="708"/>
       </w:pPr>
       <w:r>
-        <w:t>A integração entre o Front-</w:t>
-      </w:r>
-      <w:proofErr w:type="spellStart"/>
-      <w:r>
-        <w:t>end</w:t>
-      </w:r>
-      <w:proofErr w:type="spellEnd"/>
-      <w:r>
-        <w:t xml:space="preserve">, a API </w:t>
-      </w:r>
-      <w:proofErr w:type="spellStart"/>
-      <w:r>
-        <w:t>Flask</w:t>
-      </w:r>
-      <w:proofErr w:type="spellEnd"/>
-      <w:r>
-        <w:t xml:space="preserve"> e o banco de dados SQL Server </w:t>
-      </w:r>
-      <w:proofErr w:type="gramStart"/>
-      <w:r>
-        <w:t>foi</w:t>
-      </w:r>
-      <w:proofErr w:type="gramEnd"/>
-      <w:r>
-        <w:t xml:space="preserve"> validada em ambiente local. Entretanto, a aplicação ainda apresenta limitações, como a ausência de autenticação completa e a necessidade de disponibilizar a API e o banco de dados em um ambiente externo para permitir o funcionamento integrado pela internet.</w:t>
+        <w:t>A integração entre o Front-end, a API Flask e o banco de dados SQL Server foi validada em ambiente local. Entretanto, a aplicação ainda apresenta limitações, como a ausência de autenticação completa e a necessidade de disponibilizar a API e o banco de dados em um ambiente externo para permitir o funcionamento integrado pela internet.</w:t>
       </w:r>
     </w:p>
     <w:p>
@@ -6351,25 +6071,9 @@
         <w:ind w:left="708"/>
       </w:pPr>
       <w:r>
-        <w:t xml:space="preserve">FLASK. </w:t>
-      </w:r>
-      <w:proofErr w:type="spellStart"/>
-      <w:r>
-        <w:t>Flask</w:t>
-      </w:r>
-      <w:proofErr w:type="spellEnd"/>
-      <w:r>
-        <w:t xml:space="preserve"> </w:t>
-      </w:r>
-      <w:proofErr w:type="spellStart"/>
-      <w:r>
-        <w:t>Documentation</w:t>
-      </w:r>
-      <w:proofErr w:type="spellEnd"/>
-      <w:r>
-        <w:t xml:space="preserve">. Disponível em: </w:t>
-      </w:r>
-      <w:hyperlink r:id="rId36" w:history="1">
+        <w:t xml:space="preserve">FLASK. Flask Documentation. Disponível em: </w:t>
+      </w:r>
+      <w:hyperlink r:id="rId37" w:history="1">
         <w:r>
           <w:rPr>
             <w:rStyle w:val="Hyperlink"/>
@@ -6392,17 +6096,9 @@
         <w:ind w:left="708"/>
       </w:pPr>
       <w:r>
-        <w:t xml:space="preserve">FIGMA. </w:t>
-      </w:r>
-      <w:proofErr w:type="spellStart"/>
-      <w:r>
-        <w:t>Figma</w:t>
-      </w:r>
-      <w:proofErr w:type="spellEnd"/>
-      <w:r>
-        <w:t xml:space="preserve"> Help Center. Disponível em: </w:t>
-      </w:r>
-      <w:hyperlink r:id="rId37" w:history="1">
+        <w:t xml:space="preserve">FIGMA. Figma Help Center. Disponível em: </w:t>
+      </w:r>
+      <w:hyperlink r:id="rId38" w:history="1">
         <w:r>
           <w:rPr>
             <w:rStyle w:val="Hyperlink"/>
@@ -6427,7 +6123,7 @@
       <w:r>
         <w:t xml:space="preserve">GITHUB. GitHub Docs. Disponível em: </w:t>
       </w:r>
-      <w:hyperlink r:id="rId38" w:history="1">
+      <w:hyperlink r:id="rId39" w:history="1">
         <w:r>
           <w:rPr>
             <w:rStyle w:val="Hyperlink"/>
@@ -6444,18 +6140,9 @@
         <w:ind w:left="708"/>
       </w:pPr>
       <w:r>
-        <w:lastRenderedPageBreak/>
-        <w:t xml:space="preserve">MICROSOFT. SQL Server </w:t>
-      </w:r>
-      <w:proofErr w:type="spellStart"/>
-      <w:r>
-        <w:t>Documentation</w:t>
-      </w:r>
-      <w:proofErr w:type="spellEnd"/>
-      <w:r>
-        <w:t xml:space="preserve">. Disponível em: </w:t>
-      </w:r>
-      <w:hyperlink r:id="rId39" w:history="1">
+        <w:t xml:space="preserve">MICROSOFT. SQL Server Documentation. Disponível em: </w:t>
+      </w:r>
+      <w:hyperlink r:id="rId40" w:history="1">
         <w:r>
           <w:rPr>
             <w:rStyle w:val="Hyperlink"/>
@@ -6478,20 +6165,12 @@
         <w:ind w:left="708"/>
       </w:pPr>
       <w:r>
-        <w:t xml:space="preserve">PYTHON SOFTWARE FOUNDATION. Python </w:t>
-      </w:r>
-      <w:proofErr w:type="spellStart"/>
-      <w:r>
-        <w:t>Documentation</w:t>
-      </w:r>
-      <w:proofErr w:type="spellEnd"/>
-      <w:r>
-        <w:t xml:space="preserve">. </w:t>
+        <w:t xml:space="preserve">PYTHON SOFTWARE FOUNDATION. Python Documentation. </w:t>
       </w:r>
       <w:r>
         <w:t xml:space="preserve">Disponível em: </w:t>
       </w:r>
-      <w:hyperlink r:id="rId40" w:history="1">
+      <w:hyperlink r:id="rId41" w:history="1">
         <w:r>
           <w:rPr>
             <w:rStyle w:val="Hyperlink"/>
@@ -6614,12 +6293,12 @@
     </w:p>
     <w:p/>
     <w:sectPr>
-      <w:headerReference w:type="even" r:id="rId41"/>
-      <w:headerReference w:type="default" r:id="rId42"/>
-      <w:footerReference w:type="even" r:id="rId43"/>
-      <w:footerReference w:type="default" r:id="rId44"/>
-      <w:headerReference w:type="first" r:id="rId45"/>
-      <w:footerReference w:type="first" r:id="rId46"/>
+      <w:headerReference w:type="even" r:id="rId42"/>
+      <w:headerReference w:type="default" r:id="rId43"/>
+      <w:footerReference w:type="even" r:id="rId44"/>
+      <w:footerReference w:type="default" r:id="rId45"/>
+      <w:headerReference w:type="first" r:id="rId46"/>
+      <w:footerReference w:type="first" r:id="rId47"/>
       <w:pgSz w:w="11906" w:h="16838"/>
       <w:pgMar w:top="1417" w:right="1701" w:bottom="1417" w:left="1701" w:header="708" w:footer="708" w:gutter="0"/>
       <w:cols w:space="708"/>

</xml_diff>

<commit_message>
Ultima alteração do documento principal.
</commit_message>
<xml_diff>
--- a/02 - Documentação/Documento Principal.docx
+++ b/02 - Documentação/Documento Principal.docx
@@ -292,7 +292,27 @@
           <w:sz w:val="22"/>
           <w:szCs w:val="22"/>
         </w:rPr>
-        <w:t>Prof. Giuliano Lanes de Almeida, Esp.</w:t>
+        <w:t xml:space="preserve">Prof. Giuliano </w:t>
+      </w:r>
+      <w:proofErr w:type="spellStart"/>
+      <w:r>
+        <w:rPr>
+          <w:rFonts w:ascii="Arial" w:eastAsia="Arial" w:hAnsi="Arial" w:cs="Arial"/>
+          <w:color w:val="FFFFFF"/>
+          <w:sz w:val="22"/>
+          <w:szCs w:val="22"/>
+        </w:rPr>
+        <w:t>Lanes</w:t>
+      </w:r>
+      <w:proofErr w:type="spellEnd"/>
+      <w:r>
+        <w:rPr>
+          <w:rFonts w:ascii="Arial" w:eastAsia="Arial" w:hAnsi="Arial" w:cs="Arial"/>
+          <w:color w:val="FFFFFF"/>
+          <w:sz w:val="22"/>
+          <w:szCs w:val="22"/>
+        </w:rPr>
+        <w:t xml:space="preserve"> de Almeida, Esp.</w:t>
       </w:r>
     </w:p>
     <w:p>
@@ -309,7 +329,47 @@
           <w:sz w:val="22"/>
           <w:szCs w:val="22"/>
         </w:rPr>
-        <w:t>Profa. Luciane Yanase Hibara Kanashiro, Me.</w:t>
+        <w:t xml:space="preserve">Profa. Luciane </w:t>
+      </w:r>
+      <w:proofErr w:type="spellStart"/>
+      <w:r>
+        <w:rPr>
+          <w:rFonts w:ascii="Arial" w:eastAsia="Arial" w:hAnsi="Arial" w:cs="Arial"/>
+          <w:color w:val="FFFFFF"/>
+          <w:sz w:val="22"/>
+          <w:szCs w:val="22"/>
+        </w:rPr>
+        <w:t>Yanase</w:t>
+      </w:r>
+      <w:proofErr w:type="spellEnd"/>
+      <w:r>
+        <w:rPr>
+          <w:rFonts w:ascii="Arial" w:eastAsia="Arial" w:hAnsi="Arial" w:cs="Arial"/>
+          <w:color w:val="FFFFFF"/>
+          <w:sz w:val="22"/>
+          <w:szCs w:val="22"/>
+        </w:rPr>
+        <w:t xml:space="preserve"> </w:t>
+      </w:r>
+      <w:proofErr w:type="spellStart"/>
+      <w:r>
+        <w:rPr>
+          <w:rFonts w:ascii="Arial" w:eastAsia="Arial" w:hAnsi="Arial" w:cs="Arial"/>
+          <w:color w:val="FFFFFF"/>
+          <w:sz w:val="22"/>
+          <w:szCs w:val="22"/>
+        </w:rPr>
+        <w:t>Hibara</w:t>
+      </w:r>
+      <w:proofErr w:type="spellEnd"/>
+      <w:r>
+        <w:rPr>
+          <w:rFonts w:ascii="Arial" w:eastAsia="Arial" w:hAnsi="Arial" w:cs="Arial"/>
+          <w:color w:val="FFFFFF"/>
+          <w:sz w:val="22"/>
+          <w:szCs w:val="22"/>
+        </w:rPr>
+        <w:t xml:space="preserve"> Kanashiro, Me.</w:t>
       </w:r>
     </w:p>
     <w:p>
@@ -1195,7 +1255,14 @@
           <w:b/>
           <w:bCs/>
         </w:rPr>
-        <w:t>............................. 20</w:t>
+        <w:t>............................. 2</w:t>
+      </w:r>
+      <w:r>
+        <w:rPr>
+          <w:b/>
+          <w:bCs/>
+        </w:rPr>
+        <w:t>2</w:t>
       </w:r>
     </w:p>
     <w:p>
@@ -1823,8 +1890,18 @@
           <w:i/>
           <w:iCs/>
         </w:rPr>
-        <w:t>RF002 - Realizar pedido_Botão_FinalizarPedido</w:t>
-      </w:r>
+        <w:t xml:space="preserve">RF002 - Realizar </w:t>
+      </w:r>
+      <w:proofErr w:type="spellStart"/>
+      <w:r>
+        <w:rPr>
+          <w:rFonts w:asciiTheme="minorHAnsi" w:hAnsiTheme="minorHAnsi"/>
+          <w:i/>
+          <w:iCs/>
+        </w:rPr>
+        <w:t>pedido_Botão_FinalizarPedido</w:t>
+      </w:r>
+      <w:proofErr w:type="spellEnd"/>
       <w:r>
         <w:rPr>
           <w:rFonts w:asciiTheme="minorHAnsi" w:hAnsiTheme="minorHAnsi"/>
@@ -2517,7 +2594,15 @@
       </w:pPr>
       <w:r>
         <w:lastRenderedPageBreak/>
-        <w:t>O Raízes App utiliza uma arquitetura dividida em três componentes principais: Front-end, API e banco de dados. Essa organização permite separar a interface apresentada ao usuário das regras de processamento e do armazenamento das informações.</w:t>
+        <w:t>O Raízes App utiliza uma arquitetura dividida em três componentes principais: Front-</w:t>
+      </w:r>
+      <w:proofErr w:type="spellStart"/>
+      <w:r>
+        <w:t>end</w:t>
+      </w:r>
+      <w:proofErr w:type="spellEnd"/>
+      <w:r>
+        <w:t>, API e banco de dados. Essa organização permite separar a interface apresentada ao usuário das regras de processamento e do armazenamento das informações.</w:t>
       </w:r>
     </w:p>
     <w:p>
@@ -2536,10 +2621,27 @@
           <w:b/>
           <w:bCs/>
         </w:rPr>
-        <w:t>Front-end</w:t>
-      </w:r>
-      <w:r>
-        <w:t xml:space="preserve"> foi desenvolvido com HTML, CSS e JavaScript, sendo responsável pela apresentação das telas e pela interação com o cliente durante o processo de realização do pedido.</w:t>
+        <w:t>Front-</w:t>
+      </w:r>
+      <w:proofErr w:type="spellStart"/>
+      <w:r>
+        <w:rPr>
+          <w:b/>
+          <w:bCs/>
+        </w:rPr>
+        <w:t>end</w:t>
+      </w:r>
+      <w:proofErr w:type="spellEnd"/>
+      <w:r>
+        <w:t xml:space="preserve"> foi desenvolvido com HTML, CSS e </w:t>
+      </w:r>
+      <w:proofErr w:type="spellStart"/>
+      <w:r>
+        <w:t>JavaScript</w:t>
+      </w:r>
+      <w:proofErr w:type="spellEnd"/>
+      <w:r>
+        <w:t>, sendo responsável pela apresentação das telas e pela interação com o cliente durante o processo de realização do pedido.</w:t>
       </w:r>
     </w:p>
     <w:p>
@@ -2561,7 +2663,15 @@
         <w:t>API</w:t>
       </w:r>
       <w:r>
-        <w:t xml:space="preserve"> foi desenvolvida em Python, utilizando o framework Flask. Sua função é receber as requisições realizadas pela aplicação web, validar os dados e realizar as operações necessárias no banco de dados.</w:t>
+        <w:t xml:space="preserve"> foi desenvolvida em Python, utilizando o framework </w:t>
+      </w:r>
+      <w:proofErr w:type="spellStart"/>
+      <w:r>
+        <w:t>Flask</w:t>
+      </w:r>
+      <w:proofErr w:type="spellEnd"/>
+      <w:r>
+        <w:t>. Sua função é receber as requisições realizadas pela aplicação web, validar os dados e realizar as operações necessárias no banco de dados.</w:t>
       </w:r>
     </w:p>
     <w:p>
@@ -2647,12 +2757,21 @@
           <w:numId w:val="3"/>
         </w:numPr>
       </w:pPr>
-      <w:r>
-        <w:rPr>
-          <w:b/>
-          <w:bCs/>
-        </w:rPr>
-        <w:t>JavaScript:</w:t>
+      <w:proofErr w:type="spellStart"/>
+      <w:r>
+        <w:rPr>
+          <w:b/>
+          <w:bCs/>
+        </w:rPr>
+        <w:t>JavaScript</w:t>
+      </w:r>
+      <w:proofErr w:type="spellEnd"/>
+      <w:r>
+        <w:rPr>
+          <w:b/>
+          <w:bCs/>
+        </w:rPr>
+        <w:t>:</w:t>
       </w:r>
       <w:r>
         <w:t xml:space="preserve"> implementação das interações e comunicação com a API.</w:t>
@@ -2670,7 +2789,23 @@
           <w:b/>
           <w:bCs/>
         </w:rPr>
-        <w:t>Python e Flask:</w:t>
+        <w:t xml:space="preserve">Python e </w:t>
+      </w:r>
+      <w:proofErr w:type="spellStart"/>
+      <w:r>
+        <w:rPr>
+          <w:b/>
+          <w:bCs/>
+        </w:rPr>
+        <w:t>Flask</w:t>
+      </w:r>
+      <w:proofErr w:type="spellEnd"/>
+      <w:r>
+        <w:rPr>
+          <w:b/>
+          <w:bCs/>
+        </w:rPr>
+        <w:t>:</w:t>
       </w:r>
       <w:r>
         <w:t xml:space="preserve"> desenvolvimento da API.</w:t>
@@ -2683,12 +2818,21 @@
           <w:numId w:val="3"/>
         </w:numPr>
       </w:pPr>
-      <w:r>
-        <w:rPr>
-          <w:b/>
-          <w:bCs/>
-        </w:rPr>
-        <w:t>Flask-CORS:</w:t>
+      <w:proofErr w:type="spellStart"/>
+      <w:r>
+        <w:rPr>
+          <w:b/>
+          <w:bCs/>
+        </w:rPr>
+        <w:t>Flask</w:t>
+      </w:r>
+      <w:proofErr w:type="spellEnd"/>
+      <w:r>
+        <w:rPr>
+          <w:b/>
+          <w:bCs/>
+        </w:rPr>
+        <w:t>-CORS:</w:t>
       </w:r>
       <w:r>
         <w:t xml:space="preserve"> configuração do acesso entre a aplicação web e a API.</w:t>
@@ -2701,12 +2845,21 @@
           <w:numId w:val="3"/>
         </w:numPr>
       </w:pPr>
-      <w:r>
-        <w:rPr>
-          <w:b/>
-          <w:bCs/>
-        </w:rPr>
-        <w:t>PyODBC:</w:t>
+      <w:proofErr w:type="spellStart"/>
+      <w:r>
+        <w:rPr>
+          <w:b/>
+          <w:bCs/>
+        </w:rPr>
+        <w:t>PyODBC</w:t>
+      </w:r>
+      <w:proofErr w:type="spellEnd"/>
+      <w:r>
+        <w:rPr>
+          <w:b/>
+          <w:bCs/>
+        </w:rPr>
+        <w:t>:</w:t>
       </w:r>
       <w:r>
         <w:t xml:space="preserve"> comunicação entre a API e o banco de dados.</w:t>
@@ -2737,12 +2890,21 @@
           <w:numId w:val="3"/>
         </w:numPr>
       </w:pPr>
-      <w:r>
-        <w:rPr>
-          <w:b/>
-          <w:bCs/>
-        </w:rPr>
-        <w:t>Git e GitHub:</w:t>
+      <w:proofErr w:type="spellStart"/>
+      <w:r>
+        <w:rPr>
+          <w:b/>
+          <w:bCs/>
+        </w:rPr>
+        <w:t>Git</w:t>
+      </w:r>
+      <w:proofErr w:type="spellEnd"/>
+      <w:r>
+        <w:rPr>
+          <w:b/>
+          <w:bCs/>
+        </w:rPr>
+        <w:t xml:space="preserve"> e GitHub:</w:t>
       </w:r>
       <w:r>
         <w:t xml:space="preserve"> versionamento e disponibilização do código-fonte.</w:t>
@@ -2796,6 +2958,7 @@
           <w:numId w:val="4"/>
         </w:numPr>
       </w:pPr>
+      <w:proofErr w:type="spellStart"/>
       <w:r>
         <w:rPr>
           <w:b/>
@@ -2817,6 +2980,7 @@
         </w:rPr>
         <w:t>rio</w:t>
       </w:r>
+      <w:proofErr w:type="spellEnd"/>
       <w:r>
         <w:rPr>
           <w:b/>
@@ -2889,12 +3053,21 @@
           <w:numId w:val="4"/>
         </w:numPr>
       </w:pPr>
-      <w:r>
-        <w:rPr>
-          <w:b/>
-          <w:bCs/>
-        </w:rPr>
-        <w:t>ItemPedido:</w:t>
+      <w:proofErr w:type="spellStart"/>
+      <w:r>
+        <w:rPr>
+          <w:b/>
+          <w:bCs/>
+        </w:rPr>
+        <w:t>ItemPedido</w:t>
+      </w:r>
+      <w:proofErr w:type="spellEnd"/>
+      <w:r>
+        <w:rPr>
+          <w:b/>
+          <w:bCs/>
+        </w:rPr>
+        <w:t>:</w:t>
       </w:r>
       <w:r>
         <w:t xml:space="preserve"> registra os produtos que compõem cada pedido, suas quantidades e preços unitários.</w:t>
@@ -2933,7 +3106,23 @@
         </w:numPr>
       </w:pPr>
       <w:r>
-        <w:t>Durante a execução local, o Front-end envia requisições à API Flask. A API processa as solicitações, realiza as validações necessárias e acessa o banco de dados SQL Server para consultar ou registrar informações.</w:t>
+        <w:t>Durante a execução local, o Front-</w:t>
+      </w:r>
+      <w:proofErr w:type="spellStart"/>
+      <w:r>
+        <w:t>end</w:t>
+      </w:r>
+      <w:proofErr w:type="spellEnd"/>
+      <w:r>
+        <w:t xml:space="preserve"> envia requisições à API </w:t>
+      </w:r>
+      <w:proofErr w:type="spellStart"/>
+      <w:r>
+        <w:t>Flask</w:t>
+      </w:r>
+      <w:proofErr w:type="spellEnd"/>
+      <w:r>
+        <w:t>. A API processa as solicitações, realiza as validações necessárias e acessa o banco de dados SQL Server para consultar ou registrar informações.</w:t>
       </w:r>
     </w:p>
     <w:p>
@@ -2957,7 +3146,15 @@
         </w:numPr>
       </w:pPr>
       <w:r>
-        <w:t>A publicação do Front-end no GitHub Pages permite visualizar a interface pela internet. Entretanto, a API e o banco de dados permanecem configurados para execução local, de modo que a operação completa do sistema depende da execução desses componentes no ambiente de desenvolvimento.</w:t>
+        <w:t>A publicação do Front-</w:t>
+      </w:r>
+      <w:proofErr w:type="spellStart"/>
+      <w:r>
+        <w:t>end</w:t>
+      </w:r>
+      <w:proofErr w:type="spellEnd"/>
+      <w:r>
+        <w:t xml:space="preserve"> no GitHub Pages permite visualizar a interface pela internet. Entretanto, a API e o banco de dados permanecem configurados para execução local, de modo que a operação completa do sistema depende da execução desses componentes no ambiente de desenvolvimento.</w:t>
       </w:r>
       <w:r>
         <w:t xml:space="preserve"> </w:t>
@@ -3009,9 +3206,18 @@
           <w:b/>
           <w:bCs/>
         </w:rPr>
-        <w:t>5.1 Desenvolvimento do Front-end</w:t>
+        <w:t>5.1 Desenvolvimento do Front-</w:t>
+      </w:r>
+      <w:proofErr w:type="spellStart"/>
+      <w:r>
+        <w:rPr>
+          <w:b/>
+          <w:bCs/>
+        </w:rPr>
+        <w:t>end</w:t>
       </w:r>
       <w:bookmarkEnd w:id="14"/>
+      <w:proofErr w:type="spellEnd"/>
     </w:p>
     <w:p>
       <w:pPr>
@@ -3022,7 +3228,23 @@
         </w:numPr>
       </w:pPr>
       <w:r>
-        <w:t>O Front-end do Raízes App foi desenvolvido utilizando HTML, CSS e JavaScript. A interface permite que o cliente acesse a página inicial, selecione uma unidade, consulte o cardápio, visualize os produtos e organize seu pedido.</w:t>
+        <w:t>O Front-</w:t>
+      </w:r>
+      <w:proofErr w:type="spellStart"/>
+      <w:r>
+        <w:t>end</w:t>
+      </w:r>
+      <w:proofErr w:type="spellEnd"/>
+      <w:r>
+        <w:t xml:space="preserve"> do Raízes App foi desenvolvido utilizando HTML, CSS e </w:t>
+      </w:r>
+      <w:proofErr w:type="spellStart"/>
+      <w:r>
+        <w:t>JavaScript</w:t>
+      </w:r>
+      <w:proofErr w:type="spellEnd"/>
+      <w:r>
+        <w:t>. A interface permite que o cliente acesse a página inicial, selecione uma unidade, consulte o cardápio, visualize os produtos e organize seu pedido.</w:t>
       </w:r>
     </w:p>
     <w:p>
@@ -3064,7 +3286,23 @@
         </w:numPr>
       </w:pPr>
       <w:r>
-        <w:t>A API foi desenvolvida em Python, utilizando o framework Flask, e é responsável por intermediar a comunicação entre o Front-end e o banco de dados.</w:t>
+        <w:t xml:space="preserve">A API foi desenvolvida em Python, utilizando o framework </w:t>
+      </w:r>
+      <w:proofErr w:type="spellStart"/>
+      <w:r>
+        <w:t>Flask</w:t>
+      </w:r>
+      <w:proofErr w:type="spellEnd"/>
+      <w:r>
+        <w:t>, e é responsável por intermediar a comunicação entre o Front-</w:t>
+      </w:r>
+      <w:proofErr w:type="spellStart"/>
+      <w:r>
+        <w:t>end</w:t>
+      </w:r>
+      <w:proofErr w:type="spellEnd"/>
+      <w:r>
+        <w:t xml:space="preserve"> e o banco de dados.</w:t>
       </w:r>
     </w:p>
     <w:p>
@@ -3490,7 +3728,27 @@
           <w:sz w:val="22"/>
           <w:szCs w:val="22"/>
         </w:rPr>
-        <w:t>CT002 –  IdUnidade Obrigatório</w:t>
+        <w:t xml:space="preserve">CT002 –  </w:t>
+      </w:r>
+      <w:proofErr w:type="spellStart"/>
+      <w:r>
+        <w:rPr>
+          <w:i/>
+          <w:iCs/>
+          <w:sz w:val="22"/>
+          <w:szCs w:val="22"/>
+        </w:rPr>
+        <w:t>IdUnidade</w:t>
+      </w:r>
+      <w:proofErr w:type="spellEnd"/>
+      <w:r>
+        <w:rPr>
+          <w:i/>
+          <w:iCs/>
+          <w:sz w:val="22"/>
+          <w:szCs w:val="22"/>
+        </w:rPr>
+        <w:t xml:space="preserve"> Obrigatório</w:t>
       </w:r>
       <w:r>
         <w:rPr>
@@ -5439,6 +5697,7 @@
       <w:r>
         <w:br/>
       </w:r>
+      <w:proofErr w:type="spellStart"/>
       <w:r>
         <w:rPr>
           <w:i/>
@@ -5446,6 +5705,7 @@
         </w:rPr>
         <w:t>Fluxo_Pedido_Gravado_Banco</w:t>
       </w:r>
+      <w:proofErr w:type="spellEnd"/>
       <w:r>
         <w:t>.</w:t>
       </w:r>
@@ -5513,6 +5773,7 @@
       <w:r>
         <w:br/>
       </w:r>
+      <w:proofErr w:type="spellStart"/>
       <w:r>
         <w:rPr>
           <w:i/>
@@ -5520,6 +5781,7 @@
         </w:rPr>
         <w:t>Fluxo_ItemPedido_Gravado_Banco</w:t>
       </w:r>
+      <w:proofErr w:type="spellEnd"/>
       <w:r>
         <w:rPr>
           <w:i/>
@@ -5601,6 +5863,7 @@
       <w:r>
         <w:br/>
       </w:r>
+      <w:proofErr w:type="spellStart"/>
       <w:r>
         <w:rPr>
           <w:i/>
@@ -5608,6 +5871,7 @@
         </w:rPr>
         <w:t>Fluxo_Pedido_Vazio_Bloqueado</w:t>
       </w:r>
+      <w:proofErr w:type="spellEnd"/>
       <w:r>
         <w:rPr>
           <w:i/>
@@ -5679,12 +5943,21 @@
       <w:r>
         <w:br/>
       </w:r>
-      <w:r>
-        <w:rPr>
-          <w:i/>
-          <w:iCs/>
-        </w:rPr>
-        <w:t>Fluxo_Pedido_Vazio_Nao_Gravado_Banco.</w:t>
+      <w:proofErr w:type="spellStart"/>
+      <w:r>
+        <w:rPr>
+          <w:i/>
+          <w:iCs/>
+        </w:rPr>
+        <w:t>Fluxo_Pedido_Vazio_Nao_Gravado_Banco</w:t>
+      </w:r>
+      <w:proofErr w:type="spellEnd"/>
+      <w:r>
+        <w:rPr>
+          <w:i/>
+          <w:iCs/>
+        </w:rPr>
+        <w:t>.</w:t>
       </w:r>
       <w:r>
         <w:br/>
@@ -5709,45 +5982,8 @@
       <w:bookmarkEnd w:id="23"/>
     </w:p>
     <w:p>
-      <w:pPr>
-        <w:pStyle w:val="NormalWeb"/>
-        <w:numPr>
-          <w:ilvl w:val="0"/>
-          <w:numId w:val="21"/>
-        </w:numPr>
-        <w:rPr>
-          <w:rFonts w:asciiTheme="minorHAnsi" w:hAnsiTheme="minorHAnsi"/>
-        </w:rPr>
-      </w:pPr>
-      <w:r>
-        <w:rPr>
-          <w:rFonts w:asciiTheme="minorHAnsi" w:hAnsiTheme="minorHAnsi"/>
-        </w:rPr>
-        <w:t>As evidências dos testes foram registradas por meio de capturas de tela da aplicação e de consultas ao banco de dados. Os registros foram organizados conforme os cenários avaliados, permitindo demonstrar os resultados observados, as falhas identificadas e as correções aplicadas durante a validação das funcionalidades implementadas.</w:t>
-      </w:r>
-    </w:p>
-    <w:p>
-      <w:pPr>
-        <w:pStyle w:val="NormalWeb"/>
-        <w:numPr>
-          <w:ilvl w:val="0"/>
-          <w:numId w:val="21"/>
-        </w:numPr>
-        <w:rPr>
-          <w:rFonts w:asciiTheme="minorHAnsi" w:eastAsiaTheme="minorHAnsi" w:hAnsiTheme="minorHAnsi" w:cstheme="minorBidi"/>
-          <w:kern w:val="2"/>
-          <w:lang w:eastAsia="en-US"/>
-          <w14:ligatures w14:val="standardContextual"/>
-        </w:rPr>
-      </w:pPr>
-      <w:r>
-        <w:rPr>
-          <w:rFonts w:asciiTheme="minorHAnsi" w:eastAsiaTheme="minorHAnsi" w:hAnsiTheme="minorHAnsi" w:cstheme="minorBidi"/>
-          <w:kern w:val="2"/>
-          <w:lang w:eastAsia="en-US"/>
-          <w14:ligatures w14:val="standardContextual"/>
-        </w:rPr>
-        <w:t>As evidências dos testes foram organizadas de acordo com os cenários avaliados e incluídas na documentação, permitindo demonstrar os resultados obtidos durante a validação das funcionalidades implementadas.</w:t>
+      <w:r>
+        <w:t>As evidências dos testes foram registradas por meio de capturas de tela da aplicação, dos resultados das requisições à API e de consultas ao banco de dados. Os registros demonstram os cenários avaliados, as falhas identificadas e as correções aplicadas durante a validação das funcionalidades implementadas.</w:t>
       </w:r>
     </w:p>
     <w:p>
@@ -5777,11 +6013,7 @@
         </w:numPr>
       </w:pPr>
       <w:r>
-        <w:t xml:space="preserve">Os testes realizados concentraram-se nas funcionalidades implementadas e nos cenários validados durante o desenvolvimento local. Testes abrangentes de desempenho, disponibilidade, segurança e </w:t>
-      </w:r>
-      <w:r>
-        <w:lastRenderedPageBreak/>
-        <w:t>comportamento sob grande volume de acessos não foram considerados concluídos apenas com essas verificações.</w:t>
+        <w:t>Os testes realizados concentraram-se nas funcionalidades implementadas e nos cenários validados durante o desenvolvimento local. Testes abrangentes de desempenho, disponibilidade, segurança e comportamento sob grande volume de acessos não foram considerados concluídos apenas com essas verificações.</w:t>
       </w:r>
     </w:p>
     <w:p>
@@ -5828,7 +6060,15 @@
         <w:ind w:left="708"/>
       </w:pPr>
       <w:r>
-        <w:t>A aplicação Raízes do Nordeste foi desenvolvida utilizando uma arquitetura composta por Front-end, API e banco de dados, permitindo a separação das responsabilidades entre as diferentes camadas do sistema.</w:t>
+        <w:t>A aplicação Raízes do Nordeste foi desenvolvida uma arquitetura composta por Front-</w:t>
+      </w:r>
+      <w:proofErr w:type="spellStart"/>
+      <w:r>
+        <w:t>end</w:t>
+      </w:r>
+      <w:proofErr w:type="spellEnd"/>
+      <w:r>
+        <w:t>, API e banco de dados, permitindo a separação das responsabilidades entre as diferentes camadas do sistema.</w:t>
       </w:r>
     </w:p>
     <w:p>
@@ -5840,7 +6080,23 @@
           <w:b/>
           <w:bCs/>
         </w:rPr>
-        <w:t>Acesso ao front-end:</w:t>
+        <w:t>Acesso ao front-</w:t>
+      </w:r>
+      <w:proofErr w:type="spellStart"/>
+      <w:r>
+        <w:rPr>
+          <w:b/>
+          <w:bCs/>
+        </w:rPr>
+        <w:t>end</w:t>
+      </w:r>
+      <w:proofErr w:type="spellEnd"/>
+      <w:r>
+        <w:rPr>
+          <w:b/>
+          <w:bCs/>
+        </w:rPr>
+        <w:t>:</w:t>
       </w:r>
       <w:r>
         <w:br/>
@@ -5886,7 +6142,23 @@
           <w:b/>
           <w:bCs/>
         </w:rPr>
-        <w:t>Protótipo da interface no Figma:</w:t>
+        <w:t xml:space="preserve">Protótipo da interface no </w:t>
+      </w:r>
+      <w:proofErr w:type="spellStart"/>
+      <w:r>
+        <w:rPr>
+          <w:b/>
+          <w:bCs/>
+        </w:rPr>
+        <w:t>Figma</w:t>
+      </w:r>
+      <w:proofErr w:type="spellEnd"/>
+      <w:r>
+        <w:rPr>
+          <w:b/>
+          <w:bCs/>
+        </w:rPr>
+        <w:t>:</w:t>
       </w:r>
       <w:r>
         <w:br/>
@@ -5903,12 +6175,17 @@
     <w:p>
       <w:pPr>
         <w:ind w:left="708"/>
-        <w:rPr>
-          <w:u w:val="single"/>
-        </w:rPr>
-      </w:pPr>
-      <w:r>
-        <w:t>O protótipo foi elaborado no Figma para apoiar o planejamento visual da aplicação e a organização das telas e dos fluxos de navegação do Raízes App. Ele permite consultar a proposta visual desenvolvida durante a etapa de prototipação.</w:t>
+      </w:pPr>
+      <w:r>
+        <w:t xml:space="preserve">O protótipo foi elaborado no </w:t>
+      </w:r>
+      <w:proofErr w:type="spellStart"/>
+      <w:r>
+        <w:t>Figma</w:t>
+      </w:r>
+      <w:proofErr w:type="spellEnd"/>
+      <w:r>
+        <w:t xml:space="preserve"> para apoiar o planejamento visual da aplicação e a organização das telas e dos fluxos de navegação do Raízes App.</w:t>
       </w:r>
     </w:p>
     <w:p>
@@ -5916,16 +6193,15 @@
         <w:ind w:left="708"/>
       </w:pPr>
       <w:r>
-        <w:t xml:space="preserve">O Front-end foi desenvolvido utilizando HTML, CSS e JavaScript, sendo disponibilizado por meio do GitHub Pages. O código-fonte completo do projeto também foi disponibilizado em um repositório público no GitHub, contendo os arquivos relacionados à </w:t>
-      </w:r>
-      <w:r>
-        <w:rPr>
-          <w:u w:val="single"/>
-        </w:rPr>
-        <w:t>documentação</w:t>
-      </w:r>
-      <w:r>
-        <w:t>, requisitos, protótipos, banco de dados, API, Front-end, testes e evidências.</w:t>
+        <w:t>O Front-</w:t>
+      </w:r>
+      <w:proofErr w:type="spellStart"/>
+      <w:r>
+        <w:t>end</w:t>
+      </w:r>
+      <w:proofErr w:type="spellEnd"/>
+      <w:r>
+        <w:t xml:space="preserve"> foi publicado por meio do GitHub Pages, permitindo o acesso à interface pela internet. O código-fonte do projeto está disponível no repositório público do GitHub, juntamente com os documentos e artefatos desenvolvidos.</w:t>
       </w:r>
     </w:p>
     <w:p>
@@ -5933,7 +6209,15 @@
         <w:ind w:left="708"/>
       </w:pPr>
       <w:r>
-        <w:t>A API foi desenvolvida utilizando Python e Flask, sendo responsável pela comunicação entre a aplicação e o banco de dados. Para o desenvolvimento e validação do sistema, a API foi executada em ambiente local.</w:t>
+        <w:t xml:space="preserve">A API foi implementada em Python, utilizando </w:t>
+      </w:r>
+      <w:proofErr w:type="spellStart"/>
+      <w:r>
+        <w:t>Flask</w:t>
+      </w:r>
+      <w:proofErr w:type="spellEnd"/>
+      <w:r>
+        <w:t>, e o banco de dados foi desenvolvido em Microsoft SQL Server. Durante o desenvolvimento e os testes, esses componentes foram executados localmente no computador utilizado para a implementação do projeto.</w:t>
       </w:r>
     </w:p>
     <w:p>
@@ -5941,7 +6225,30 @@
         <w:ind w:left="708"/>
       </w:pPr>
       <w:r>
-        <w:t>O banco de dados foi desenvolvido em Microsoft SQL Server, contendo as estruturas necessárias para o funcionamento da aplicação, incluindo usuários, unidades, produtos, pedidos e itens dos pedidos.</w:t>
+        <w:rPr>
+          <w:b/>
+          <w:bCs/>
+        </w:rPr>
+        <w:t>É importante destacar que a publicação do Front-</w:t>
+      </w:r>
+      <w:proofErr w:type="spellStart"/>
+      <w:r>
+        <w:rPr>
+          <w:b/>
+          <w:bCs/>
+        </w:rPr>
+        <w:t>end</w:t>
+      </w:r>
+      <w:proofErr w:type="spellEnd"/>
+      <w:r>
+        <w:rPr>
+          <w:b/>
+          <w:bCs/>
+        </w:rPr>
+        <w:t xml:space="preserve"> não disponibiliza automaticamente a API e o banco de dados na internet.</w:t>
+      </w:r>
+      <w:r>
+        <w:t xml:space="preserve"> Dessa forma, quando o site é acessado por outro computador ou dispositivo, a aplicação não consegue se comunicar com a API executada apenas no ambiente local de desenvolvimento. Para que todas as funcionalidades operem de forma integrada pela internet, será necessário hospedar a API em um servidor acessível externamente e disponibilizar o banco de dados em uma infraestrutura compatível.</w:t>
       </w:r>
     </w:p>
     <w:p>
@@ -5949,35 +6256,24 @@
         <w:ind w:left="708"/>
       </w:pPr>
       <w:r>
-        <w:t xml:space="preserve">Durante o desenvolvimento, a aplicação foi testada em ambiente local, permitindo validar a comunicação entre o Front-end, a API e o banco de </w:t>
-      </w:r>
+        <w:t>Apesar dessa limitação, a integração entre o Front-</w:t>
+      </w:r>
+      <w:proofErr w:type="spellStart"/>
+      <w:r>
+        <w:t>end</w:t>
+      </w:r>
+      <w:proofErr w:type="spellEnd"/>
+      <w:r>
+        <w:t>, a API e o banco de dados foi testada localmente. Os resultados e as evidências dos testes realizados estão apresentados nesta documentação.</w:t>
+      </w:r>
+    </w:p>
+    <w:p>
+      <w:pPr>
+        <w:ind w:left="708"/>
+      </w:pPr>
       <w:r>
         <w:lastRenderedPageBreak/>
-        <w:t>dados, bem como executar os testes funcionais e registrar as respectivas evidências.</w:t>
-      </w:r>
-    </w:p>
-    <w:p>
-      <w:pPr>
-        <w:ind w:left="708"/>
-      </w:pPr>
-      <w:r>
-        <w:t>Para a disponibilização completa da aplicação em um ambiente externo, permitindo que usuários e avaliadores acessem todas as funcionalidades por meio da internet, é necessária a configuração de um ambiente de hospedagem para a API e para o banco de dados. Essa etapa envolve a disponibilização da API Flask em um servidor acessível externamente e a configuração do banco de dados em uma infraestrutura compatível.</w:t>
-      </w:r>
-    </w:p>
-    <w:p>
-      <w:pPr>
-        <w:ind w:left="708"/>
-      </w:pPr>
-      <w:r>
-        <w:t>Dessa forma, o projeto apresenta a implementação das principais funcionalidades do sistema, além da documentação da arquitetura, dos requisitos, dos testes realizados e das condições necessárias para sua implantação em ambiente de produção.</w:t>
-      </w:r>
-    </w:p>
-    <w:p>
-      <w:pPr>
-        <w:ind w:left="708"/>
-      </w:pPr>
-      <w:r>
-        <w:t>O código-fonte e os demais materiais do projeto encontram-se organizados no repositório GitHub, permitindo a consulta e avaliação dos artefatos desenvolvidos.</w:t>
+        <w:t>Assim, o projeto apresenta a implementação das principais funcionalidades do Raízes App, seus artefatos técnicos e os resultados obtidos durante a validação, além de documentar as etapas necessárias para sua futura implantação em ambiente de produção.</w:t>
       </w:r>
     </w:p>
     <w:p>
@@ -6028,7 +6324,23 @@
         <w:ind w:left="708"/>
       </w:pPr>
       <w:r>
-        <w:t>A integração entre o Front-end, a API Flask e o banco de dados SQL Server foi validada em ambiente local. Entretanto, a aplicação ainda apresenta limitações, como a ausência de autenticação completa e a necessidade de disponibilizar a API e o banco de dados em um ambiente externo para permitir o funcionamento integrado pela internet.</w:t>
+        <w:t>A integração entre o Front-</w:t>
+      </w:r>
+      <w:proofErr w:type="spellStart"/>
+      <w:r>
+        <w:t>end</w:t>
+      </w:r>
+      <w:proofErr w:type="spellEnd"/>
+      <w:r>
+        <w:t xml:space="preserve">, a API </w:t>
+      </w:r>
+      <w:proofErr w:type="spellStart"/>
+      <w:r>
+        <w:t>Flask</w:t>
+      </w:r>
+      <w:proofErr w:type="spellEnd"/>
+      <w:r>
+        <w:t xml:space="preserve"> e o banco de dados SQL Server foi validada em ambiente local. Entretanto, a aplicação ainda apresenta limitações, como a ausência de autenticação completa e a necessidade de disponibilizar a API e o banco de dados em um ambiente externo para permitir o funcionamento integrado pela internet.</w:t>
       </w:r>
     </w:p>
     <w:p>
@@ -6071,7 +6383,23 @@
         <w:ind w:left="708"/>
       </w:pPr>
       <w:r>
-        <w:t xml:space="preserve">FLASK. Flask Documentation. Disponível em: </w:t>
+        <w:t xml:space="preserve">FLASK. </w:t>
+      </w:r>
+      <w:proofErr w:type="spellStart"/>
+      <w:r>
+        <w:t>Flask</w:t>
+      </w:r>
+      <w:proofErr w:type="spellEnd"/>
+      <w:r>
+        <w:t xml:space="preserve"> </w:t>
+      </w:r>
+      <w:proofErr w:type="spellStart"/>
+      <w:r>
+        <w:t>Documentation</w:t>
+      </w:r>
+      <w:proofErr w:type="spellEnd"/>
+      <w:r>
+        <w:t xml:space="preserve">. Disponível em: </w:t>
       </w:r>
       <w:hyperlink r:id="rId37" w:history="1">
         <w:r>
@@ -6096,7 +6424,15 @@
         <w:ind w:left="708"/>
       </w:pPr>
       <w:r>
-        <w:t xml:space="preserve">FIGMA. Figma Help Center. Disponível em: </w:t>
+        <w:t xml:space="preserve">FIGMA. </w:t>
+      </w:r>
+      <w:proofErr w:type="spellStart"/>
+      <w:r>
+        <w:t>Figma</w:t>
+      </w:r>
+      <w:proofErr w:type="spellEnd"/>
+      <w:r>
+        <w:t xml:space="preserve"> Help Center. Disponível em: </w:t>
       </w:r>
       <w:hyperlink r:id="rId38" w:history="1">
         <w:r>
@@ -6140,7 +6476,15 @@
         <w:ind w:left="708"/>
       </w:pPr>
       <w:r>
-        <w:t xml:space="preserve">MICROSOFT. SQL Server Documentation. Disponível em: </w:t>
+        <w:t xml:space="preserve">MICROSOFT. SQL Server </w:t>
+      </w:r>
+      <w:proofErr w:type="spellStart"/>
+      <w:r>
+        <w:t>Documentation</w:t>
+      </w:r>
+      <w:proofErr w:type="spellEnd"/>
+      <w:r>
+        <w:t xml:space="preserve">. Disponível em: </w:t>
       </w:r>
       <w:hyperlink r:id="rId40" w:history="1">
         <w:r>
@@ -6165,7 +6509,16 @@
         <w:ind w:left="708"/>
       </w:pPr>
       <w:r>
-        <w:t xml:space="preserve">PYTHON SOFTWARE FOUNDATION. Python Documentation. </w:t>
+        <w:lastRenderedPageBreak/>
+        <w:t xml:space="preserve">PYTHON SOFTWARE FOUNDATION. Python </w:t>
+      </w:r>
+      <w:proofErr w:type="spellStart"/>
+      <w:r>
+        <w:t>Documentation</w:t>
+      </w:r>
+      <w:proofErr w:type="spellEnd"/>
+      <w:r>
+        <w:t xml:space="preserve">. </w:t>
       </w:r>
       <w:r>
         <w:t xml:space="preserve">Disponível em: </w:t>
@@ -10188,7 +10541,6 @@
   <w:style w:type="character" w:default="1" w:styleId="Fontepargpadro">
     <w:name w:val="Default Paragraph Font"/>
     <w:uiPriority w:val="1"/>
-    <w:semiHidden/>
     <w:unhideWhenUsed/>
   </w:style>
   <w:style w:type="table" w:default="1" w:styleId="Tabelanormal">

</xml_diff>

<commit_message>
Foi acrescentado o link do player do figma na sessão 7
</commit_message>
<xml_diff>
--- a/02 - Documentação/Documento Principal.docx
+++ b/02 - Documentação/Documento Principal.docx
@@ -292,27 +292,7 @@
           <w:sz w:val="22"/>
           <w:szCs w:val="22"/>
         </w:rPr>
-        <w:t xml:space="preserve">Prof. Giuliano </w:t>
-      </w:r>
-      <w:proofErr w:type="spellStart"/>
-      <w:r>
-        <w:rPr>
-          <w:rFonts w:ascii="Arial" w:eastAsia="Arial" w:hAnsi="Arial" w:cs="Arial"/>
-          <w:color w:val="FFFFFF"/>
-          <w:sz w:val="22"/>
-          <w:szCs w:val="22"/>
-        </w:rPr>
-        <w:t>Lanes</w:t>
-      </w:r>
-      <w:proofErr w:type="spellEnd"/>
-      <w:r>
-        <w:rPr>
-          <w:rFonts w:ascii="Arial" w:eastAsia="Arial" w:hAnsi="Arial" w:cs="Arial"/>
-          <w:color w:val="FFFFFF"/>
-          <w:sz w:val="22"/>
-          <w:szCs w:val="22"/>
-        </w:rPr>
-        <w:t xml:space="preserve"> de Almeida, Esp.</w:t>
+        <w:t>Prof. Giuliano Lanes de Almeida, Esp.</w:t>
       </w:r>
     </w:p>
     <w:p>
@@ -329,47 +309,7 @@
           <w:sz w:val="22"/>
           <w:szCs w:val="22"/>
         </w:rPr>
-        <w:t xml:space="preserve">Profa. Luciane </w:t>
-      </w:r>
-      <w:proofErr w:type="spellStart"/>
-      <w:r>
-        <w:rPr>
-          <w:rFonts w:ascii="Arial" w:eastAsia="Arial" w:hAnsi="Arial" w:cs="Arial"/>
-          <w:color w:val="FFFFFF"/>
-          <w:sz w:val="22"/>
-          <w:szCs w:val="22"/>
-        </w:rPr>
-        <w:t>Yanase</w:t>
-      </w:r>
-      <w:proofErr w:type="spellEnd"/>
-      <w:r>
-        <w:rPr>
-          <w:rFonts w:ascii="Arial" w:eastAsia="Arial" w:hAnsi="Arial" w:cs="Arial"/>
-          <w:color w:val="FFFFFF"/>
-          <w:sz w:val="22"/>
-          <w:szCs w:val="22"/>
-        </w:rPr>
-        <w:t xml:space="preserve"> </w:t>
-      </w:r>
-      <w:proofErr w:type="spellStart"/>
-      <w:r>
-        <w:rPr>
-          <w:rFonts w:ascii="Arial" w:eastAsia="Arial" w:hAnsi="Arial" w:cs="Arial"/>
-          <w:color w:val="FFFFFF"/>
-          <w:sz w:val="22"/>
-          <w:szCs w:val="22"/>
-        </w:rPr>
-        <w:t>Hibara</w:t>
-      </w:r>
-      <w:proofErr w:type="spellEnd"/>
-      <w:r>
-        <w:rPr>
-          <w:rFonts w:ascii="Arial" w:eastAsia="Arial" w:hAnsi="Arial" w:cs="Arial"/>
-          <w:color w:val="FFFFFF"/>
-          <w:sz w:val="22"/>
-          <w:szCs w:val="22"/>
-        </w:rPr>
-        <w:t xml:space="preserve"> Kanashiro, Me.</w:t>
+        <w:t>Profa. Luciane Yanase Hibara Kanashiro, Me.</w:t>
       </w:r>
     </w:p>
     <w:p>
@@ -1890,43 +1830,33 @@
           <w:i/>
           <w:iCs/>
         </w:rPr>
-        <w:t xml:space="preserve">RF002 - Realizar </w:t>
-      </w:r>
-      <w:proofErr w:type="spellStart"/>
+        <w:t>RF002 - Realizar pedido_Botão_FinalizarPedido</w:t>
+      </w:r>
       <w:r>
         <w:rPr>
           <w:rFonts w:asciiTheme="minorHAnsi" w:hAnsiTheme="minorHAnsi"/>
           <w:i/>
           <w:iCs/>
         </w:rPr>
-        <w:t>pedido_Botão_FinalizarPedido</w:t>
-      </w:r>
-      <w:proofErr w:type="spellEnd"/>
-      <w:r>
+        <w:t>.</w:t>
+      </w:r>
+    </w:p>
+    <w:p>
+      <w:pPr>
+        <w:pStyle w:val="NormalWeb"/>
         <w:rPr>
           <w:rFonts w:asciiTheme="minorHAnsi" w:hAnsiTheme="minorHAnsi"/>
-          <w:i/>
-          <w:iCs/>
-        </w:rPr>
-        <w:t>.</w:t>
-      </w:r>
-    </w:p>
-    <w:p>
-      <w:pPr>
-        <w:pStyle w:val="NormalWeb"/>
+        </w:rPr>
+      </w:pPr>
+      <w:r>
         <w:rPr>
           <w:rFonts w:asciiTheme="minorHAnsi" w:hAnsiTheme="minorHAnsi"/>
-        </w:rPr>
-      </w:pPr>
-      <w:r>
-        <w:rPr>
-          <w:rFonts w:asciiTheme="minorHAnsi" w:hAnsiTheme="minorHAnsi"/>
           <w:b/>
           <w:bCs/>
           <w:noProof/>
         </w:rPr>
         <w:drawing>
-          <wp:anchor distT="0" distB="0" distL="114300" distR="114300" simplePos="0" relativeHeight="251659264" behindDoc="1" locked="0" layoutInCell="1" allowOverlap="1" wp14:anchorId="2FD084F6" wp14:editId="04C59C96">
+          <wp:anchor distT="0" distB="0" distL="114300" distR="114300" simplePos="0" relativeHeight="251659264" behindDoc="1" locked="0" layoutInCell="1" allowOverlap="1" wp14:anchorId="2FD084F6" wp14:editId="3E42CAEC">
             <wp:simplePos x="0" y="0"/>
             <wp:positionH relativeFrom="margin">
               <wp:posOffset>-124460</wp:posOffset>
@@ -2131,15 +2061,7 @@
           <w:i/>
           <w:iCs/>
         </w:rPr>
-        <w:t>RF004 - Visualizar cardápio</w:t>
-      </w:r>
-      <w:r>
-        <w:rPr>
-          <w:rFonts w:asciiTheme="minorHAnsi" w:hAnsiTheme="minorHAnsi"/>
-          <w:i/>
-          <w:iCs/>
-        </w:rPr>
-        <w:t>.</w:t>
+        <w:t>RF004 - Visualizar cardápio.</w:t>
       </w:r>
     </w:p>
     <w:p>
@@ -2245,15 +2167,7 @@
           <w:i/>
           <w:iCs/>
         </w:rPr>
-        <w:t>RF005 - Visualizar produtos</w:t>
-      </w:r>
-      <w:r>
-        <w:rPr>
-          <w:rFonts w:asciiTheme="minorHAnsi" w:hAnsiTheme="minorHAnsi"/>
-          <w:i/>
-          <w:iCs/>
-        </w:rPr>
-        <w:t>.</w:t>
+        <w:t>RF005 - Visualizar produtos.</w:t>
       </w:r>
     </w:p>
     <w:p>
@@ -2359,15 +2273,7 @@
           <w:i/>
           <w:iCs/>
         </w:rPr>
-        <w:t>RF006 - Adicionar produto ao pedido</w:t>
-      </w:r>
-      <w:r>
-        <w:rPr>
-          <w:rFonts w:asciiTheme="minorHAnsi" w:hAnsiTheme="minorHAnsi"/>
-          <w:i/>
-          <w:iCs/>
-        </w:rPr>
-        <w:t>.</w:t>
+        <w:t>RF006 - Adicionar produto ao pedido.</w:t>
       </w:r>
     </w:p>
     <w:p>
@@ -2594,15 +2500,7 @@
       </w:pPr>
       <w:r>
         <w:lastRenderedPageBreak/>
-        <w:t>O Raízes App utiliza uma arquitetura dividida em três componentes principais: Front-</w:t>
-      </w:r>
-      <w:proofErr w:type="spellStart"/>
-      <w:r>
-        <w:t>end</w:t>
-      </w:r>
-      <w:proofErr w:type="spellEnd"/>
-      <w:r>
-        <w:t>, API e banco de dados. Essa organização permite separar a interface apresentada ao usuário das regras de processamento e do armazenamento das informações.</w:t>
+        <w:t>O Raízes App utiliza uma arquitetura dividida em três componentes principais: Front-end, API e banco de dados. Essa organização permite separar a interface apresentada ao usuário das regras de processamento e do armazenamento das informações.</w:t>
       </w:r>
     </w:p>
     <w:p>
@@ -2621,27 +2519,10 @@
           <w:b/>
           <w:bCs/>
         </w:rPr>
-        <w:t>Front-</w:t>
-      </w:r>
-      <w:proofErr w:type="spellStart"/>
-      <w:r>
-        <w:rPr>
-          <w:b/>
-          <w:bCs/>
-        </w:rPr>
-        <w:t>end</w:t>
-      </w:r>
-      <w:proofErr w:type="spellEnd"/>
-      <w:r>
-        <w:t xml:space="preserve"> foi desenvolvido com HTML, CSS e </w:t>
-      </w:r>
-      <w:proofErr w:type="spellStart"/>
-      <w:r>
-        <w:t>JavaScript</w:t>
-      </w:r>
-      <w:proofErr w:type="spellEnd"/>
-      <w:r>
-        <w:t>, sendo responsável pela apresentação das telas e pela interação com o cliente durante o processo de realização do pedido.</w:t>
+        <w:t>Front-end</w:t>
+      </w:r>
+      <w:r>
+        <w:t xml:space="preserve"> foi desenvolvido com HTML, CSS e JavaScript, sendo responsável pela apresentação das telas e pela interação com o cliente durante o processo de realização do pedido.</w:t>
       </w:r>
     </w:p>
     <w:p>
@@ -2663,15 +2544,7 @@
         <w:t>API</w:t>
       </w:r>
       <w:r>
-        <w:t xml:space="preserve"> foi desenvolvida em Python, utilizando o framework </w:t>
-      </w:r>
-      <w:proofErr w:type="spellStart"/>
-      <w:r>
-        <w:t>Flask</w:t>
-      </w:r>
-      <w:proofErr w:type="spellEnd"/>
-      <w:r>
-        <w:t>. Sua função é receber as requisições realizadas pela aplicação web, validar os dados e realizar as operações necessárias no banco de dados.</w:t>
+        <w:t xml:space="preserve"> foi desenvolvida em Python, utilizando o framework Flask. Sua função é receber as requisições realizadas pela aplicação web, validar os dados e realizar as operações necessárias no banco de dados.</w:t>
       </w:r>
     </w:p>
     <w:p>
@@ -2757,21 +2630,12 @@
           <w:numId w:val="3"/>
         </w:numPr>
       </w:pPr>
-      <w:proofErr w:type="spellStart"/>
-      <w:r>
-        <w:rPr>
-          <w:b/>
-          <w:bCs/>
-        </w:rPr>
-        <w:t>JavaScript</w:t>
-      </w:r>
-      <w:proofErr w:type="spellEnd"/>
-      <w:r>
-        <w:rPr>
-          <w:b/>
-          <w:bCs/>
-        </w:rPr>
-        <w:t>:</w:t>
+      <w:r>
+        <w:rPr>
+          <w:b/>
+          <w:bCs/>
+        </w:rPr>
+        <w:t>JavaScript:</w:t>
       </w:r>
       <w:r>
         <w:t xml:space="preserve"> implementação das interações e comunicação com a API.</w:t>
@@ -2789,23 +2653,7 @@
           <w:b/>
           <w:bCs/>
         </w:rPr>
-        <w:t xml:space="preserve">Python e </w:t>
-      </w:r>
-      <w:proofErr w:type="spellStart"/>
-      <w:r>
-        <w:rPr>
-          <w:b/>
-          <w:bCs/>
-        </w:rPr>
-        <w:t>Flask</w:t>
-      </w:r>
-      <w:proofErr w:type="spellEnd"/>
-      <w:r>
-        <w:rPr>
-          <w:b/>
-          <w:bCs/>
-        </w:rPr>
-        <w:t>:</w:t>
+        <w:t>Python e Flask:</w:t>
       </w:r>
       <w:r>
         <w:t xml:space="preserve"> desenvolvimento da API.</w:t>
@@ -2818,21 +2666,12 @@
           <w:numId w:val="3"/>
         </w:numPr>
       </w:pPr>
-      <w:proofErr w:type="spellStart"/>
-      <w:r>
-        <w:rPr>
-          <w:b/>
-          <w:bCs/>
-        </w:rPr>
-        <w:t>Flask</w:t>
-      </w:r>
-      <w:proofErr w:type="spellEnd"/>
-      <w:r>
-        <w:rPr>
-          <w:b/>
-          <w:bCs/>
-        </w:rPr>
-        <w:t>-CORS:</w:t>
+      <w:r>
+        <w:rPr>
+          <w:b/>
+          <w:bCs/>
+        </w:rPr>
+        <w:t>Flask-CORS:</w:t>
       </w:r>
       <w:r>
         <w:t xml:space="preserve"> configuração do acesso entre a aplicação web e a API.</w:t>
@@ -2845,21 +2684,12 @@
           <w:numId w:val="3"/>
         </w:numPr>
       </w:pPr>
-      <w:proofErr w:type="spellStart"/>
-      <w:r>
-        <w:rPr>
-          <w:b/>
-          <w:bCs/>
-        </w:rPr>
-        <w:t>PyODBC</w:t>
-      </w:r>
-      <w:proofErr w:type="spellEnd"/>
-      <w:r>
-        <w:rPr>
-          <w:b/>
-          <w:bCs/>
-        </w:rPr>
-        <w:t>:</w:t>
+      <w:r>
+        <w:rPr>
+          <w:b/>
+          <w:bCs/>
+        </w:rPr>
+        <w:t>PyODBC:</w:t>
       </w:r>
       <w:r>
         <w:t xml:space="preserve"> comunicação entre a API e o banco de dados.</w:t>
@@ -2890,21 +2720,12 @@
           <w:numId w:val="3"/>
         </w:numPr>
       </w:pPr>
-      <w:proofErr w:type="spellStart"/>
-      <w:r>
-        <w:rPr>
-          <w:b/>
-          <w:bCs/>
-        </w:rPr>
-        <w:t>Git</w:t>
-      </w:r>
-      <w:proofErr w:type="spellEnd"/>
-      <w:r>
-        <w:rPr>
-          <w:b/>
-          <w:bCs/>
-        </w:rPr>
-        <w:t xml:space="preserve"> e GitHub:</w:t>
+      <w:r>
+        <w:rPr>
+          <w:b/>
+          <w:bCs/>
+        </w:rPr>
+        <w:t>Git e GitHub:</w:t>
       </w:r>
       <w:r>
         <w:t xml:space="preserve"> versionamento e disponibilização do código-fonte.</w:t>
@@ -2958,7 +2779,6 @@
           <w:numId w:val="4"/>
         </w:numPr>
       </w:pPr>
-      <w:proofErr w:type="spellStart"/>
       <w:r>
         <w:rPr>
           <w:b/>
@@ -2980,7 +2800,6 @@
         </w:rPr>
         <w:t>rio</w:t>
       </w:r>
-      <w:proofErr w:type="spellEnd"/>
       <w:r>
         <w:rPr>
           <w:b/>
@@ -3053,21 +2872,12 @@
           <w:numId w:val="4"/>
         </w:numPr>
       </w:pPr>
-      <w:proofErr w:type="spellStart"/>
-      <w:r>
-        <w:rPr>
-          <w:b/>
-          <w:bCs/>
-        </w:rPr>
-        <w:t>ItemPedido</w:t>
-      </w:r>
-      <w:proofErr w:type="spellEnd"/>
-      <w:r>
-        <w:rPr>
-          <w:b/>
-          <w:bCs/>
-        </w:rPr>
-        <w:t>:</w:t>
+      <w:r>
+        <w:rPr>
+          <w:b/>
+          <w:bCs/>
+        </w:rPr>
+        <w:t>ItemPedido:</w:t>
       </w:r>
       <w:r>
         <w:t xml:space="preserve"> registra os produtos que compõem cada pedido, suas quantidades e preços unitários.</w:t>
@@ -3106,23 +2916,7 @@
         </w:numPr>
       </w:pPr>
       <w:r>
-        <w:t>Durante a execução local, o Front-</w:t>
-      </w:r>
-      <w:proofErr w:type="spellStart"/>
-      <w:r>
-        <w:t>end</w:t>
-      </w:r>
-      <w:proofErr w:type="spellEnd"/>
-      <w:r>
-        <w:t xml:space="preserve"> envia requisições à API </w:t>
-      </w:r>
-      <w:proofErr w:type="spellStart"/>
-      <w:r>
-        <w:t>Flask</w:t>
-      </w:r>
-      <w:proofErr w:type="spellEnd"/>
-      <w:r>
-        <w:t>. A API processa as solicitações, realiza as validações necessárias e acessa o banco de dados SQL Server para consultar ou registrar informações.</w:t>
+        <w:t>Durante a execução local, o Front-end envia requisições à API Flask. A API processa as solicitações, realiza as validações necessárias e acessa o banco de dados SQL Server para consultar ou registrar informações.</w:t>
       </w:r>
     </w:p>
     <w:p>
@@ -3146,15 +2940,7 @@
         </w:numPr>
       </w:pPr>
       <w:r>
-        <w:t>A publicação do Front-</w:t>
-      </w:r>
-      <w:proofErr w:type="spellStart"/>
-      <w:r>
-        <w:t>end</w:t>
-      </w:r>
-      <w:proofErr w:type="spellEnd"/>
-      <w:r>
-        <w:t xml:space="preserve"> no GitHub Pages permite visualizar a interface pela internet. Entretanto, a API e o banco de dados permanecem configurados para execução local, de modo que a operação completa do sistema depende da execução desses componentes no ambiente de desenvolvimento.</w:t>
+        <w:t>A publicação do Front-end no GitHub Pages permite visualizar a interface pela internet. Entretanto, a API e o banco de dados permanecem configurados para execução local, de modo que a operação completa do sistema depende da execução desses componentes no ambiente de desenvolvimento.</w:t>
       </w:r>
       <w:r>
         <w:t xml:space="preserve"> </w:t>
@@ -3206,18 +2992,9 @@
           <w:b/>
           <w:bCs/>
         </w:rPr>
-        <w:t>5.1 Desenvolvimento do Front-</w:t>
-      </w:r>
-      <w:proofErr w:type="spellStart"/>
-      <w:r>
-        <w:rPr>
-          <w:b/>
-          <w:bCs/>
-        </w:rPr>
-        <w:t>end</w:t>
+        <w:t>5.1 Desenvolvimento do Front-end</w:t>
       </w:r>
       <w:bookmarkEnd w:id="14"/>
-      <w:proofErr w:type="spellEnd"/>
     </w:p>
     <w:p>
       <w:pPr>
@@ -3228,23 +3005,7 @@
         </w:numPr>
       </w:pPr>
       <w:r>
-        <w:t>O Front-</w:t>
-      </w:r>
-      <w:proofErr w:type="spellStart"/>
-      <w:r>
-        <w:t>end</w:t>
-      </w:r>
-      <w:proofErr w:type="spellEnd"/>
-      <w:r>
-        <w:t xml:space="preserve"> do Raízes App foi desenvolvido utilizando HTML, CSS e </w:t>
-      </w:r>
-      <w:proofErr w:type="spellStart"/>
-      <w:r>
-        <w:t>JavaScript</w:t>
-      </w:r>
-      <w:proofErr w:type="spellEnd"/>
-      <w:r>
-        <w:t>. A interface permite que o cliente acesse a página inicial, selecione uma unidade, consulte o cardápio, visualize os produtos e organize seu pedido.</w:t>
+        <w:t>O Front-end do Raízes App foi desenvolvido utilizando HTML, CSS e JavaScript. A interface permite que o cliente acesse a página inicial, selecione uma unidade, consulte o cardápio, visualize os produtos e organize seu pedido.</w:t>
       </w:r>
     </w:p>
     <w:p>
@@ -3286,23 +3047,7 @@
         </w:numPr>
       </w:pPr>
       <w:r>
-        <w:t xml:space="preserve">A API foi desenvolvida em Python, utilizando o framework </w:t>
-      </w:r>
-      <w:proofErr w:type="spellStart"/>
-      <w:r>
-        <w:t>Flask</w:t>
-      </w:r>
-      <w:proofErr w:type="spellEnd"/>
-      <w:r>
-        <w:t>, e é responsável por intermediar a comunicação entre o Front-</w:t>
-      </w:r>
-      <w:proofErr w:type="spellStart"/>
-      <w:r>
-        <w:t>end</w:t>
-      </w:r>
-      <w:proofErr w:type="spellEnd"/>
-      <w:r>
-        <w:t xml:space="preserve"> e o banco de dados.</w:t>
+        <w:t>A API foi desenvolvida em Python, utilizando o framework Flask, e é responsável por intermediar a comunicação entre o Front-end e o banco de dados.</w:t>
       </w:r>
     </w:p>
     <w:p>
@@ -3728,27 +3473,7 @@
           <w:sz w:val="22"/>
           <w:szCs w:val="22"/>
         </w:rPr>
-        <w:t xml:space="preserve">CT002 –  </w:t>
-      </w:r>
-      <w:proofErr w:type="spellStart"/>
-      <w:r>
-        <w:rPr>
-          <w:i/>
-          <w:iCs/>
-          <w:sz w:val="22"/>
-          <w:szCs w:val="22"/>
-        </w:rPr>
-        <w:t>IdUnidade</w:t>
-      </w:r>
-      <w:proofErr w:type="spellEnd"/>
-      <w:r>
-        <w:rPr>
-          <w:i/>
-          <w:iCs/>
-          <w:sz w:val="22"/>
-          <w:szCs w:val="22"/>
-        </w:rPr>
-        <w:t xml:space="preserve"> Obrigatório</w:t>
+        <w:t>CT002 –  IdUnidade Obrigatório</w:t>
       </w:r>
       <w:r>
         <w:rPr>
@@ -5697,7 +5422,6 @@
       <w:r>
         <w:br/>
       </w:r>
-      <w:proofErr w:type="spellStart"/>
       <w:r>
         <w:rPr>
           <w:i/>
@@ -5705,7 +5429,6 @@
         </w:rPr>
         <w:t>Fluxo_Pedido_Gravado_Banco</w:t>
       </w:r>
-      <w:proofErr w:type="spellEnd"/>
       <w:r>
         <w:t>.</w:t>
       </w:r>
@@ -5773,21 +5496,12 @@
       <w:r>
         <w:br/>
       </w:r>
-      <w:proofErr w:type="spellStart"/>
-      <w:r>
-        <w:rPr>
-          <w:i/>
-          <w:iCs/>
-        </w:rPr>
-        <w:t>Fluxo_ItemPedido_Gravado_Banco</w:t>
-      </w:r>
-      <w:proofErr w:type="spellEnd"/>
-      <w:r>
-        <w:rPr>
-          <w:i/>
-          <w:iCs/>
-        </w:rPr>
-        <w:t>.</w:t>
+      <w:r>
+        <w:rPr>
+          <w:i/>
+          <w:iCs/>
+        </w:rPr>
+        <w:t>Fluxo_ItemPedido_Gravado_Banco.</w:t>
       </w:r>
       <w:r>
         <w:br/>
@@ -5812,7 +5526,7 @@
         </w:rPr>
         <w:lastRenderedPageBreak/>
         <w:drawing>
-          <wp:inline distT="0" distB="0" distL="0" distR="0" wp14:anchorId="54FFFB6E" wp14:editId="237619B9">
+          <wp:inline distT="0" distB="0" distL="0" distR="0" wp14:anchorId="54FFFB6E" wp14:editId="088DAD6C">
             <wp:extent cx="5394960" cy="1844040"/>
             <wp:effectExtent l="0" t="0" r="0" b="3810"/>
             <wp:docPr id="1492892451" name="Imagem 11"/>
@@ -5863,21 +5577,12 @@
       <w:r>
         <w:br/>
       </w:r>
-      <w:proofErr w:type="spellStart"/>
-      <w:r>
-        <w:rPr>
-          <w:i/>
-          <w:iCs/>
-        </w:rPr>
-        <w:t>Fluxo_Pedido_Vazio_Bloqueado</w:t>
-      </w:r>
-      <w:proofErr w:type="spellEnd"/>
-      <w:r>
-        <w:rPr>
-          <w:i/>
-          <w:iCs/>
-        </w:rPr>
-        <w:t>.</w:t>
+      <w:r>
+        <w:rPr>
+          <w:i/>
+          <w:iCs/>
+        </w:rPr>
+        <w:t>Fluxo_Pedido_Vazio_Bloqueado.</w:t>
       </w:r>
     </w:p>
     <w:p>
@@ -5943,21 +5648,12 @@
       <w:r>
         <w:br/>
       </w:r>
-      <w:proofErr w:type="spellStart"/>
-      <w:r>
-        <w:rPr>
-          <w:i/>
-          <w:iCs/>
-        </w:rPr>
-        <w:t>Fluxo_Pedido_Vazio_Nao_Gravado_Banco</w:t>
-      </w:r>
-      <w:proofErr w:type="spellEnd"/>
-      <w:r>
-        <w:rPr>
-          <w:i/>
-          <w:iCs/>
-        </w:rPr>
-        <w:t>.</w:t>
+      <w:r>
+        <w:rPr>
+          <w:i/>
+          <w:iCs/>
+        </w:rPr>
+        <w:t>Fluxo_Pedido_Vazio_Nao_Gravado_Banco.</w:t>
       </w:r>
       <w:r>
         <w:br/>
@@ -6060,15 +5756,7 @@
         <w:ind w:left="708"/>
       </w:pPr>
       <w:r>
-        <w:t>A aplicação Raízes do Nordeste foi desenvolvida uma arquitetura composta por Front-</w:t>
-      </w:r>
-      <w:proofErr w:type="spellStart"/>
-      <w:r>
-        <w:t>end</w:t>
-      </w:r>
-      <w:proofErr w:type="spellEnd"/>
-      <w:r>
-        <w:t>, API e banco de dados, permitindo a separação das responsabilidades entre as diferentes camadas do sistema.</w:t>
+        <w:t>A aplicação Raízes do Nordeste foi desenvolvida uma arquitetura composta por Front-end, API e banco de dados, permitindo a separação das responsabilidades entre as diferentes camadas do sistema.</w:t>
       </w:r>
     </w:p>
     <w:p>
@@ -6080,23 +5768,7 @@
           <w:b/>
           <w:bCs/>
         </w:rPr>
-        <w:t>Acesso ao front-</w:t>
-      </w:r>
-      <w:proofErr w:type="spellStart"/>
-      <w:r>
-        <w:rPr>
-          <w:b/>
-          <w:bCs/>
-        </w:rPr>
-        <w:t>end</w:t>
-      </w:r>
-      <w:proofErr w:type="spellEnd"/>
-      <w:r>
-        <w:rPr>
-          <w:b/>
-          <w:bCs/>
-        </w:rPr>
-        <w:t>:</w:t>
+        <w:t>Acesso ao front-end:</w:t>
       </w:r>
       <w:r>
         <w:br/>
@@ -6142,23 +5814,7 @@
           <w:b/>
           <w:bCs/>
         </w:rPr>
-        <w:t xml:space="preserve">Protótipo da interface no </w:t>
-      </w:r>
-      <w:proofErr w:type="spellStart"/>
-      <w:r>
-        <w:rPr>
-          <w:b/>
-          <w:bCs/>
-        </w:rPr>
-        <w:t>Figma</w:t>
-      </w:r>
-      <w:proofErr w:type="spellEnd"/>
-      <w:r>
-        <w:rPr>
-          <w:b/>
-          <w:bCs/>
-        </w:rPr>
-        <w:t>:</w:t>
+        <w:t>Protótipo da interface no Figma:</w:t>
       </w:r>
       <w:r>
         <w:br/>
@@ -6171,21 +5827,39 @@
           <w:t>https://www.figma.com/design/IYvtIDxdkUGh2Z8MHHiNyK/Raizes-App?node-id=0-1&amp;t=lOXEI8KXYVUQJKHe-1</w:t>
         </w:r>
       </w:hyperlink>
+      <w:r>
+        <w:br/>
+      </w:r>
+      <w:r>
+        <w:br/>
+      </w:r>
+      <w:hyperlink r:id="rId37" w:history="1">
+        <w:r>
+          <w:rPr>
+            <w:rStyle w:val="Hyperlink"/>
+          </w:rPr>
+          <w:t>https://www.figma.com/proto/IYvtIDxdkUGh2Z8MHHiNyK/Raizes-App?node-id=1-4&amp;t=wV</w:t>
+        </w:r>
+        <w:r>
+          <w:rPr>
+            <w:rStyle w:val="Hyperlink"/>
+          </w:rPr>
+          <w:t>V</w:t>
+        </w:r>
+        <w:r>
+          <w:rPr>
+            <w:rStyle w:val="Hyperlink"/>
+          </w:rPr>
+          <w:t>uSvS0p9m5PDtj-0&amp;scaling=min-zoom&amp;content-scaling=fixed&amp;page-id=0%3A1&amp;starting-point-node-id=1%3A4</w:t>
+        </w:r>
+      </w:hyperlink>
     </w:p>
     <w:p>
       <w:pPr>
         <w:ind w:left="708"/>
       </w:pPr>
       <w:r>
-        <w:t xml:space="preserve">O protótipo foi elaborado no </w:t>
-      </w:r>
-      <w:proofErr w:type="spellStart"/>
-      <w:r>
-        <w:t>Figma</w:t>
-      </w:r>
-      <w:proofErr w:type="spellEnd"/>
-      <w:r>
-        <w:t xml:space="preserve"> para apoiar o planejamento visual da aplicação e a organização das telas e dos fluxos de navegação do Raízes App.</w:t>
+        <w:t>O protótipo foi elaborado no Figma para apoiar o planejamento visual da aplicação e a organização das telas e dos fluxos de navegação do Raízes App.</w:t>
       </w:r>
     </w:p>
     <w:p>
@@ -6193,15 +5867,7 @@
         <w:ind w:left="708"/>
       </w:pPr>
       <w:r>
-        <w:t>O Front-</w:t>
-      </w:r>
-      <w:proofErr w:type="spellStart"/>
-      <w:r>
-        <w:t>end</w:t>
-      </w:r>
-      <w:proofErr w:type="spellEnd"/>
-      <w:r>
-        <w:t xml:space="preserve"> foi publicado por meio do GitHub Pages, permitindo o acesso à interface pela internet. O código-fonte do projeto está disponível no repositório público do GitHub, juntamente com os documentos e artefatos desenvolvidos.</w:t>
+        <w:t>O Front-end foi publicado por meio do GitHub Pages, permitindo o acesso à interface pela internet. O código-fonte do projeto está disponível no repositório público do GitHub, juntamente com os documentos e artefatos desenvolvidos.</w:t>
       </w:r>
     </w:p>
     <w:p>
@@ -6209,15 +5875,7 @@
         <w:ind w:left="708"/>
       </w:pPr>
       <w:r>
-        <w:t xml:space="preserve">A API foi implementada em Python, utilizando </w:t>
-      </w:r>
-      <w:proofErr w:type="spellStart"/>
-      <w:r>
-        <w:t>Flask</w:t>
-      </w:r>
-      <w:proofErr w:type="spellEnd"/>
-      <w:r>
-        <w:t>, e o banco de dados foi desenvolvido em Microsoft SQL Server. Durante o desenvolvimento e os testes, esses componentes foram executados localmente no computador utilizado para a implementação do projeto.</w:t>
+        <w:t>A API foi implementada em Python, utilizando Flask, e o banco de dados foi desenvolvido em Microsoft SQL Server. Durante o desenvolvimento e os testes, esses componentes foram executados localmente no computador utilizado para a implementação do projeto.</w:t>
       </w:r>
     </w:p>
     <w:p>
@@ -6229,23 +5887,7 @@
           <w:b/>
           <w:bCs/>
         </w:rPr>
-        <w:t>É importante destacar que a publicação do Front-</w:t>
-      </w:r>
-      <w:proofErr w:type="spellStart"/>
-      <w:r>
-        <w:rPr>
-          <w:b/>
-          <w:bCs/>
-        </w:rPr>
-        <w:t>end</w:t>
-      </w:r>
-      <w:proofErr w:type="spellEnd"/>
-      <w:r>
-        <w:rPr>
-          <w:b/>
-          <w:bCs/>
-        </w:rPr>
-        <w:t xml:space="preserve"> não disponibiliza automaticamente a API e o banco de dados na internet.</w:t>
+        <w:t>É importante destacar que a publicação do Front-end não disponibiliza automaticamente a API e o banco de dados na internet.</w:t>
       </w:r>
       <w:r>
         <w:t xml:space="preserve"> Dessa forma, quando o site é acessado por outro computador ou dispositivo, a aplicação não consegue se comunicar com a API executada apenas no ambiente local de desenvolvimento. Para que todas as funcionalidades operem de forma integrada pela internet, será necessário hospedar a API em um servidor acessível externamente e disponibilizar o banco de dados em uma infraestrutura compatível.</w:t>
@@ -6256,15 +5898,8 @@
         <w:ind w:left="708"/>
       </w:pPr>
       <w:r>
-        <w:t>Apesar dessa limitação, a integração entre o Front-</w:t>
-      </w:r>
-      <w:proofErr w:type="spellStart"/>
-      <w:r>
-        <w:t>end</w:t>
-      </w:r>
-      <w:proofErr w:type="spellEnd"/>
-      <w:r>
-        <w:t>, a API e o banco de dados foi testada localmente. Os resultados e as evidências dos testes realizados estão apresentados nesta documentação.</w:t>
+        <w:lastRenderedPageBreak/>
+        <w:t>Apesar dessa limitação, a integração entre o Front-end, a API e o banco de dados foi testada localmente. Os resultados e as evidências dos testes realizados estão apresentados nesta documentação.</w:t>
       </w:r>
     </w:p>
     <w:p>
@@ -6272,7 +5907,6 @@
         <w:ind w:left="708"/>
       </w:pPr>
       <w:r>
-        <w:lastRenderedPageBreak/>
         <w:t>Assim, o projeto apresenta a implementação das principais funcionalidades do Raízes App, seus artefatos técnicos e os resultados obtidos durante a validação, além de documentar as etapas necessárias para sua futura implantação em ambiente de produção.</w:t>
       </w:r>
     </w:p>
@@ -6324,23 +5958,7 @@
         <w:ind w:left="708"/>
       </w:pPr>
       <w:r>
-        <w:t>A integração entre o Front-</w:t>
-      </w:r>
-      <w:proofErr w:type="spellStart"/>
-      <w:r>
-        <w:t>end</w:t>
-      </w:r>
-      <w:proofErr w:type="spellEnd"/>
-      <w:r>
-        <w:t xml:space="preserve">, a API </w:t>
-      </w:r>
-      <w:proofErr w:type="spellStart"/>
-      <w:r>
-        <w:t>Flask</w:t>
-      </w:r>
-      <w:proofErr w:type="spellEnd"/>
-      <w:r>
-        <w:t xml:space="preserve"> e o banco de dados SQL Server foi validada em ambiente local. Entretanto, a aplicação ainda apresenta limitações, como a ausência de autenticação completa e a necessidade de disponibilizar a API e o banco de dados em um ambiente externo para permitir o funcionamento integrado pela internet.</w:t>
+        <w:t>A integração entre o Front-end, a API Flask e o banco de dados SQL Server foi validada em ambiente local. Entretanto, a aplicação ainda apresenta limitações, como a ausência de autenticação completa e a necessidade de disponibilizar a API e o banco de dados em um ambiente externo para permitir o funcionamento integrado pela internet.</w:t>
       </w:r>
     </w:p>
     <w:p>
@@ -6383,25 +6001,9 @@
         <w:ind w:left="708"/>
       </w:pPr>
       <w:r>
-        <w:t xml:space="preserve">FLASK. </w:t>
-      </w:r>
-      <w:proofErr w:type="spellStart"/>
-      <w:r>
-        <w:t>Flask</w:t>
-      </w:r>
-      <w:proofErr w:type="spellEnd"/>
-      <w:r>
-        <w:t xml:space="preserve"> </w:t>
-      </w:r>
-      <w:proofErr w:type="spellStart"/>
-      <w:r>
-        <w:t>Documentation</w:t>
-      </w:r>
-      <w:proofErr w:type="spellEnd"/>
-      <w:r>
-        <w:t xml:space="preserve">. Disponível em: </w:t>
-      </w:r>
-      <w:hyperlink r:id="rId37" w:history="1">
+        <w:t xml:space="preserve">FLASK. Flask Documentation. Disponível em: </w:t>
+      </w:r>
+      <w:hyperlink r:id="rId38" w:history="1">
         <w:r>
           <w:rPr>
             <w:rStyle w:val="Hyperlink"/>
@@ -6424,17 +6026,9 @@
         <w:ind w:left="708"/>
       </w:pPr>
       <w:r>
-        <w:t xml:space="preserve">FIGMA. </w:t>
-      </w:r>
-      <w:proofErr w:type="spellStart"/>
-      <w:r>
-        <w:t>Figma</w:t>
-      </w:r>
-      <w:proofErr w:type="spellEnd"/>
-      <w:r>
-        <w:t xml:space="preserve"> Help Center. Disponível em: </w:t>
-      </w:r>
-      <w:hyperlink r:id="rId38" w:history="1">
+        <w:t xml:space="preserve">FIGMA. Figma Help Center. Disponível em: </w:t>
+      </w:r>
+      <w:hyperlink r:id="rId39" w:history="1">
         <w:r>
           <w:rPr>
             <w:rStyle w:val="Hyperlink"/>
@@ -6457,9 +6051,10 @@
         <w:ind w:left="708"/>
       </w:pPr>
       <w:r>
+        <w:lastRenderedPageBreak/>
         <w:t xml:space="preserve">GITHUB. GitHub Docs. Disponível em: </w:t>
       </w:r>
-      <w:hyperlink r:id="rId39" w:history="1">
+      <w:hyperlink r:id="rId40" w:history="1">
         <w:r>
           <w:rPr>
             <w:rStyle w:val="Hyperlink"/>
@@ -6476,17 +6071,9 @@
         <w:ind w:left="708"/>
       </w:pPr>
       <w:r>
-        <w:t xml:space="preserve">MICROSOFT. SQL Server </w:t>
-      </w:r>
-      <w:proofErr w:type="spellStart"/>
-      <w:r>
-        <w:t>Documentation</w:t>
-      </w:r>
-      <w:proofErr w:type="spellEnd"/>
-      <w:r>
-        <w:t xml:space="preserve">. Disponível em: </w:t>
-      </w:r>
-      <w:hyperlink r:id="rId40" w:history="1">
+        <w:t xml:space="preserve">MICROSOFT. SQL Server Documentation. Disponível em: </w:t>
+      </w:r>
+      <w:hyperlink r:id="rId41" w:history="1">
         <w:r>
           <w:rPr>
             <w:rStyle w:val="Hyperlink"/>
@@ -6509,21 +6096,12 @@
         <w:ind w:left="708"/>
       </w:pPr>
       <w:r>
-        <w:lastRenderedPageBreak/>
-        <w:t xml:space="preserve">PYTHON SOFTWARE FOUNDATION. Python </w:t>
-      </w:r>
-      <w:proofErr w:type="spellStart"/>
-      <w:r>
-        <w:t>Documentation</w:t>
-      </w:r>
-      <w:proofErr w:type="spellEnd"/>
-      <w:r>
-        <w:t xml:space="preserve">. </w:t>
+        <w:t xml:space="preserve">PYTHON SOFTWARE FOUNDATION. Python Documentation. </w:t>
       </w:r>
       <w:r>
         <w:t xml:space="preserve">Disponível em: </w:t>
       </w:r>
-      <w:hyperlink r:id="rId41" w:history="1">
+      <w:hyperlink r:id="rId42" w:history="1">
         <w:r>
           <w:rPr>
             <w:rStyle w:val="Hyperlink"/>
@@ -6646,12 +6224,12 @@
     </w:p>
     <w:p/>
     <w:sectPr>
-      <w:headerReference w:type="even" r:id="rId42"/>
-      <w:headerReference w:type="default" r:id="rId43"/>
-      <w:footerReference w:type="even" r:id="rId44"/>
-      <w:footerReference w:type="default" r:id="rId45"/>
-      <w:headerReference w:type="first" r:id="rId46"/>
-      <w:footerReference w:type="first" r:id="rId47"/>
+      <w:headerReference w:type="even" r:id="rId43"/>
+      <w:headerReference w:type="default" r:id="rId44"/>
+      <w:footerReference w:type="even" r:id="rId45"/>
+      <w:footerReference w:type="default" r:id="rId46"/>
+      <w:headerReference w:type="first" r:id="rId47"/>
+      <w:footerReference w:type="first" r:id="rId48"/>
       <w:pgSz w:w="11906" w:h="16838"/>
       <w:pgMar w:top="1417" w:right="1701" w:bottom="1417" w:left="1701" w:header="708" w:footer="708" w:gutter="0"/>
       <w:cols w:space="708"/>
@@ -10541,6 +10119,7 @@
   <w:style w:type="character" w:default="1" w:styleId="Fontepargpadro">
     <w:name w:val="Default Paragraph Font"/>
     <w:uiPriority w:val="1"/>
+    <w:semiHidden/>
     <w:unhideWhenUsed/>
   </w:style>
   <w:style w:type="table" w:default="1" w:styleId="Tabelanormal">

</xml_diff>